<commit_message>
clase sobre abaco para operaciones matemáticas
</commit_message>
<xml_diff>
--- a/clases_2025_1/1_documentos_actas/2_Acta de inicio cursos práctica 2025-1.docx
+++ b/clases_2025_1/1_documentos_actas/2_Acta de inicio cursos práctica 2025-1.docx
@@ -380,6 +380,15 @@
         </w:rPr>
         <w:t xml:space="preserve"> </w:t>
       </w:r>
+      <w:r>
+        <w:rPr>
+          <w:rFonts w:ascii="Times New Roman" w:hAnsi="Times New Roman"/>
+          <w:sz w:val="24"/>
+          <w:szCs w:val="24"/>
+          <w:lang w:val="es-ES"/>
+        </w:rPr>
+        <w:t>440 estudiantes.</w:t>
+      </w:r>
     </w:p>
     <w:p>
       <w:pPr>
@@ -465,7 +474,19 @@
           <w:szCs w:val="24"/>
           <w:lang w:val="es-ES"/>
         </w:rPr>
-        <w:t>10 de marzo de 2025</w:t>
+        <w:t>20</w:t>
+      </w:r>
+      <w:r>
+        <w:rPr>
+          <w:rFonts w:ascii="Times New Roman" w:hAnsi="Times New Roman"/>
+          <w:b/>
+          <w:bCs/>
+          <w:iCs/>
+          <w:sz w:val="24"/>
+          <w:szCs w:val="24"/>
+          <w:lang w:val="es-ES"/>
+        </w:rPr>
+        <w:t xml:space="preserve"> de marzo de 2025</w:t>
       </w:r>
     </w:p>
     <w:p>
@@ -626,7 +647,7 @@
     </w:p>
     <w:tbl>
       <w:tblPr>
-        <w:tblW w:w="0" w:type="auto"/>
+        <w:tblW w:w="12290" w:type="dxa"/>
         <w:jc w:val="center"/>
         <w:tblBorders>
           <w:top w:val="single" w:sz="4" w:space="0" w:color="auto"/>
@@ -640,8 +661,9 @@
       </w:tblPr>
       <w:tblGrid>
         <w:gridCol w:w="3003"/>
-        <w:gridCol w:w="1435"/>
+        <w:gridCol w:w="2170"/>
         <w:gridCol w:w="1941"/>
+        <w:gridCol w:w="2588"/>
         <w:gridCol w:w="2588"/>
       </w:tblGrid>
       <w:tr>
@@ -681,7 +703,7 @@
         </w:tc>
         <w:tc>
           <w:tcPr>
-            <w:tcW w:w="1423" w:type="dxa"/>
+            <w:tcW w:w="2170" w:type="dxa"/>
             <w:shd w:val="clear" w:color="auto" w:fill="EAF1DD"/>
           </w:tcPr>
           <w:p>
@@ -768,6 +790,36 @@
                 <w:lang w:val="es-CO"/>
               </w:rPr>
               <w:t>Día(s) y horario de la práctica</w:t>
+            </w:r>
+          </w:p>
+        </w:tc>
+        <w:tc>
+          <w:tcPr>
+            <w:tcW w:w="2588" w:type="dxa"/>
+            <w:shd w:val="clear" w:color="auto" w:fill="EAF1DD"/>
+          </w:tcPr>
+          <w:p>
+            <w:pPr>
+              <w:pStyle w:val="Prrafodelista"/>
+              <w:spacing w:after="0" w:line="240" w:lineRule="auto"/>
+              <w:ind w:left="0"/>
+              <w:jc w:val="both"/>
+              <w:rPr>
+                <w:rFonts w:ascii="Times New Roman" w:hAnsi="Times New Roman"/>
+                <w:sz w:val="24"/>
+                <w:szCs w:val="24"/>
+                <w:u w:val="single"/>
+                <w:lang w:val="es-CO"/>
+              </w:rPr>
+            </w:pPr>
+            <w:r>
+              <w:rPr>
+                <w:rFonts w:ascii="Times New Roman" w:hAnsi="Times New Roman"/>
+                <w:sz w:val="24"/>
+                <w:szCs w:val="24"/>
+                <w:lang w:val="es-CO"/>
+              </w:rPr>
+              <w:t>Firma</w:t>
             </w:r>
           </w:p>
         </w:tc>
@@ -788,7 +840,7 @@
         </w:tc>
         <w:tc>
           <w:tcPr>
-            <w:tcW w:w="1423" w:type="dxa"/>
+            <w:tcW w:w="2170" w:type="dxa"/>
           </w:tcPr>
           <w:p>
             <w:r>
@@ -842,8 +894,24 @@
                 <w:sz w:val="24"/>
                 <w:szCs w:val="24"/>
               </w:rPr>
-              <w:t>6 a 11 de la mañana</w:t>
-            </w:r>
+              <w:t>Jueves: 6 a 11 de la mañana</w:t>
+            </w:r>
+          </w:p>
+        </w:tc>
+        <w:tc>
+          <w:tcPr>
+            <w:tcW w:w="2588" w:type="dxa"/>
+          </w:tcPr>
+          <w:p>
+            <w:pPr>
+              <w:spacing w:after="0" w:line="240" w:lineRule="auto"/>
+              <w:jc w:val="both"/>
+              <w:rPr>
+                <w:rFonts w:ascii="Times New Roman" w:hAnsi="Times New Roman" w:cs="Times New Roman"/>
+                <w:sz w:val="24"/>
+                <w:szCs w:val="24"/>
+              </w:rPr>
+            </w:pPr>
           </w:p>
         </w:tc>
       </w:tr>
@@ -863,7 +931,7 @@
         </w:tc>
         <w:tc>
           <w:tcPr>
-            <w:tcW w:w="1423" w:type="dxa"/>
+            <w:tcW w:w="2170" w:type="dxa"/>
           </w:tcPr>
           <w:p>
             <w:r>
@@ -917,8 +985,24 @@
                 <w:sz w:val="24"/>
                 <w:szCs w:val="24"/>
               </w:rPr>
-              <w:t>6 a 11 de la mañana</w:t>
-            </w:r>
+              <w:t>Jueves: 6 a 11 de la mañana</w:t>
+            </w:r>
+          </w:p>
+        </w:tc>
+        <w:tc>
+          <w:tcPr>
+            <w:tcW w:w="2588" w:type="dxa"/>
+          </w:tcPr>
+          <w:p>
+            <w:pPr>
+              <w:spacing w:after="0" w:line="240" w:lineRule="auto"/>
+              <w:jc w:val="both"/>
+              <w:rPr>
+                <w:rFonts w:ascii="Times New Roman" w:hAnsi="Times New Roman" w:cs="Times New Roman"/>
+                <w:sz w:val="24"/>
+                <w:szCs w:val="24"/>
+              </w:rPr>
+            </w:pPr>
           </w:p>
         </w:tc>
       </w:tr>
@@ -938,7 +1022,7 @@
         </w:tc>
         <w:tc>
           <w:tcPr>
-            <w:tcW w:w="1423" w:type="dxa"/>
+            <w:tcW w:w="2170" w:type="dxa"/>
           </w:tcPr>
           <w:p>
             <w:r>
@@ -992,8 +1076,24 @@
                 <w:sz w:val="24"/>
                 <w:szCs w:val="24"/>
               </w:rPr>
-              <w:t>6 a 11 de la mañana</w:t>
-            </w:r>
+              <w:t>Jueves 6 a 11 de la mañana</w:t>
+            </w:r>
+          </w:p>
+        </w:tc>
+        <w:tc>
+          <w:tcPr>
+            <w:tcW w:w="2588" w:type="dxa"/>
+          </w:tcPr>
+          <w:p>
+            <w:pPr>
+              <w:spacing w:after="0" w:line="240" w:lineRule="auto"/>
+              <w:jc w:val="both"/>
+              <w:rPr>
+                <w:rFonts w:ascii="Times New Roman" w:hAnsi="Times New Roman" w:cs="Times New Roman"/>
+                <w:sz w:val="24"/>
+                <w:szCs w:val="24"/>
+              </w:rPr>
+            </w:pPr>
           </w:p>
         </w:tc>
       </w:tr>
@@ -1013,7 +1113,7 @@
         </w:tc>
         <w:tc>
           <w:tcPr>
-            <w:tcW w:w="1423" w:type="dxa"/>
+            <w:tcW w:w="2170" w:type="dxa"/>
           </w:tcPr>
           <w:p>
             <w:r>
@@ -1069,6 +1169,22 @@
               </w:rPr>
               <w:t>6 a 11 de la mañana</w:t>
             </w:r>
+          </w:p>
+        </w:tc>
+        <w:tc>
+          <w:tcPr>
+            <w:tcW w:w="2588" w:type="dxa"/>
+          </w:tcPr>
+          <w:p>
+            <w:pPr>
+              <w:spacing w:after="0" w:line="240" w:lineRule="auto"/>
+              <w:jc w:val="both"/>
+              <w:rPr>
+                <w:rFonts w:ascii="Times New Roman" w:hAnsi="Times New Roman" w:cs="Times New Roman"/>
+                <w:sz w:val="24"/>
+                <w:szCs w:val="24"/>
+              </w:rPr>
+            </w:pPr>
           </w:p>
         </w:tc>
       </w:tr>
@@ -1088,7 +1204,7 @@
         </w:tc>
         <w:tc>
           <w:tcPr>
-            <w:tcW w:w="1423" w:type="dxa"/>
+            <w:tcW w:w="2170" w:type="dxa"/>
           </w:tcPr>
           <w:p>
             <w:r>
@@ -1144,6 +1260,22 @@
               </w:rPr>
               <w:t>6 a 11 de la mañana</w:t>
             </w:r>
+          </w:p>
+        </w:tc>
+        <w:tc>
+          <w:tcPr>
+            <w:tcW w:w="2588" w:type="dxa"/>
+          </w:tcPr>
+          <w:p>
+            <w:pPr>
+              <w:spacing w:after="0" w:line="240" w:lineRule="auto"/>
+              <w:jc w:val="both"/>
+              <w:rPr>
+                <w:rFonts w:ascii="Times New Roman" w:hAnsi="Times New Roman" w:cs="Times New Roman"/>
+                <w:sz w:val="24"/>
+                <w:szCs w:val="24"/>
+              </w:rPr>
+            </w:pPr>
           </w:p>
         </w:tc>
       </w:tr>
@@ -1163,7 +1295,7 @@
         </w:tc>
         <w:tc>
           <w:tcPr>
-            <w:tcW w:w="1423" w:type="dxa"/>
+            <w:tcW w:w="2170" w:type="dxa"/>
           </w:tcPr>
           <w:p>
             <w:r>
@@ -1219,6 +1351,22 @@
               </w:rPr>
               <w:t>6 a 11 de la mañana</w:t>
             </w:r>
+          </w:p>
+        </w:tc>
+        <w:tc>
+          <w:tcPr>
+            <w:tcW w:w="2588" w:type="dxa"/>
+          </w:tcPr>
+          <w:p>
+            <w:pPr>
+              <w:spacing w:after="0" w:line="240" w:lineRule="auto"/>
+              <w:jc w:val="both"/>
+              <w:rPr>
+                <w:rFonts w:ascii="Times New Roman" w:hAnsi="Times New Roman" w:cs="Times New Roman"/>
+                <w:sz w:val="24"/>
+                <w:szCs w:val="24"/>
+              </w:rPr>
+            </w:pPr>
           </w:p>
         </w:tc>
       </w:tr>
@@ -1238,7 +1386,7 @@
         </w:tc>
         <w:tc>
           <w:tcPr>
-            <w:tcW w:w="1423" w:type="dxa"/>
+            <w:tcW w:w="2170" w:type="dxa"/>
           </w:tcPr>
           <w:p>
             <w:r>
@@ -1294,6 +1442,22 @@
               </w:rPr>
               <w:t>6 a 11 de la mañana</w:t>
             </w:r>
+          </w:p>
+        </w:tc>
+        <w:tc>
+          <w:tcPr>
+            <w:tcW w:w="2588" w:type="dxa"/>
+          </w:tcPr>
+          <w:p>
+            <w:pPr>
+              <w:spacing w:after="0" w:line="240" w:lineRule="auto"/>
+              <w:jc w:val="both"/>
+              <w:rPr>
+                <w:rFonts w:ascii="Times New Roman" w:hAnsi="Times New Roman" w:cs="Times New Roman"/>
+                <w:sz w:val="24"/>
+                <w:szCs w:val="24"/>
+              </w:rPr>
+            </w:pPr>
           </w:p>
         </w:tc>
       </w:tr>
@@ -1313,7 +1477,7 @@
         </w:tc>
         <w:tc>
           <w:tcPr>
-            <w:tcW w:w="1423" w:type="dxa"/>
+            <w:tcW w:w="2170" w:type="dxa"/>
           </w:tcPr>
           <w:p>
             <w:r>
@@ -1369,6 +1533,22 @@
               </w:rPr>
               <w:t>6 a 11 de la mañana</w:t>
             </w:r>
+          </w:p>
+        </w:tc>
+        <w:tc>
+          <w:tcPr>
+            <w:tcW w:w="2588" w:type="dxa"/>
+          </w:tcPr>
+          <w:p>
+            <w:pPr>
+              <w:spacing w:after="0" w:line="240" w:lineRule="auto"/>
+              <w:jc w:val="both"/>
+              <w:rPr>
+                <w:rFonts w:ascii="Times New Roman" w:hAnsi="Times New Roman" w:cs="Times New Roman"/>
+                <w:sz w:val="24"/>
+                <w:szCs w:val="24"/>
+              </w:rPr>
+            </w:pPr>
           </w:p>
         </w:tc>
       </w:tr>
@@ -1388,7 +1568,7 @@
         </w:tc>
         <w:tc>
           <w:tcPr>
-            <w:tcW w:w="1423" w:type="dxa"/>
+            <w:tcW w:w="2170" w:type="dxa"/>
           </w:tcPr>
           <w:p>
             <w:r>
@@ -1444,6 +1624,22 @@
               </w:rPr>
               <w:t>6 a 11 de la mañana</w:t>
             </w:r>
+          </w:p>
+        </w:tc>
+        <w:tc>
+          <w:tcPr>
+            <w:tcW w:w="2588" w:type="dxa"/>
+          </w:tcPr>
+          <w:p>
+            <w:pPr>
+              <w:spacing w:after="0" w:line="240" w:lineRule="auto"/>
+              <w:jc w:val="both"/>
+              <w:rPr>
+                <w:rFonts w:ascii="Times New Roman" w:hAnsi="Times New Roman" w:cs="Times New Roman"/>
+                <w:sz w:val="24"/>
+                <w:szCs w:val="24"/>
+              </w:rPr>
+            </w:pPr>
           </w:p>
         </w:tc>
       </w:tr>
@@ -1463,7 +1659,7 @@
         </w:tc>
         <w:tc>
           <w:tcPr>
-            <w:tcW w:w="1423" w:type="dxa"/>
+            <w:tcW w:w="2170" w:type="dxa"/>
           </w:tcPr>
           <w:p>
             <w:r>
@@ -1519,6 +1715,22 @@
               </w:rPr>
               <w:t>6 a 11 de la mañana</w:t>
             </w:r>
+          </w:p>
+        </w:tc>
+        <w:tc>
+          <w:tcPr>
+            <w:tcW w:w="2588" w:type="dxa"/>
+          </w:tcPr>
+          <w:p>
+            <w:pPr>
+              <w:spacing w:after="0" w:line="240" w:lineRule="auto"/>
+              <w:jc w:val="both"/>
+              <w:rPr>
+                <w:rFonts w:ascii="Times New Roman" w:hAnsi="Times New Roman" w:cs="Times New Roman"/>
+                <w:sz w:val="24"/>
+                <w:szCs w:val="24"/>
+              </w:rPr>
+            </w:pPr>
           </w:p>
         </w:tc>
       </w:tr>
@@ -1538,7 +1750,7 @@
         </w:tc>
         <w:tc>
           <w:tcPr>
-            <w:tcW w:w="1423" w:type="dxa"/>
+            <w:tcW w:w="2170" w:type="dxa"/>
           </w:tcPr>
           <w:p>
             <w:r>
@@ -1594,6 +1806,22 @@
               </w:rPr>
               <w:t>6 a 11 de la mañana</w:t>
             </w:r>
+          </w:p>
+        </w:tc>
+        <w:tc>
+          <w:tcPr>
+            <w:tcW w:w="2588" w:type="dxa"/>
+          </w:tcPr>
+          <w:p>
+            <w:pPr>
+              <w:spacing w:after="0" w:line="240" w:lineRule="auto"/>
+              <w:jc w:val="both"/>
+              <w:rPr>
+                <w:rFonts w:ascii="Times New Roman" w:hAnsi="Times New Roman" w:cs="Times New Roman"/>
+                <w:sz w:val="24"/>
+                <w:szCs w:val="24"/>
+              </w:rPr>
+            </w:pPr>
           </w:p>
         </w:tc>
       </w:tr>
@@ -1613,7 +1841,7 @@
         </w:tc>
         <w:tc>
           <w:tcPr>
-            <w:tcW w:w="1423" w:type="dxa"/>
+            <w:tcW w:w="2170" w:type="dxa"/>
           </w:tcPr>
           <w:p>
             <w:r>
@@ -1669,6 +1897,22 @@
               </w:rPr>
               <w:t>6 a 11 de la mañana</w:t>
             </w:r>
+          </w:p>
+        </w:tc>
+        <w:tc>
+          <w:tcPr>
+            <w:tcW w:w="2588" w:type="dxa"/>
+          </w:tcPr>
+          <w:p>
+            <w:pPr>
+              <w:spacing w:after="0" w:line="240" w:lineRule="auto"/>
+              <w:jc w:val="both"/>
+              <w:rPr>
+                <w:rFonts w:ascii="Times New Roman" w:hAnsi="Times New Roman" w:cs="Times New Roman"/>
+                <w:sz w:val="24"/>
+                <w:szCs w:val="24"/>
+              </w:rPr>
+            </w:pPr>
           </w:p>
         </w:tc>
       </w:tr>
@@ -1688,7 +1932,7 @@
         </w:tc>
         <w:tc>
           <w:tcPr>
-            <w:tcW w:w="1423" w:type="dxa"/>
+            <w:tcW w:w="2170" w:type="dxa"/>
           </w:tcPr>
           <w:p>
             <w:r>
@@ -1744,6 +1988,22 @@
               </w:rPr>
               <w:t>6 a 11 de la mañana</w:t>
             </w:r>
+          </w:p>
+        </w:tc>
+        <w:tc>
+          <w:tcPr>
+            <w:tcW w:w="2588" w:type="dxa"/>
+          </w:tcPr>
+          <w:p>
+            <w:pPr>
+              <w:spacing w:after="0" w:line="240" w:lineRule="auto"/>
+              <w:jc w:val="both"/>
+              <w:rPr>
+                <w:rFonts w:ascii="Times New Roman" w:hAnsi="Times New Roman" w:cs="Times New Roman"/>
+                <w:sz w:val="24"/>
+                <w:szCs w:val="24"/>
+              </w:rPr>
+            </w:pPr>
           </w:p>
         </w:tc>
       </w:tr>
@@ -1763,7 +2023,7 @@
         </w:tc>
         <w:tc>
           <w:tcPr>
-            <w:tcW w:w="1423" w:type="dxa"/>
+            <w:tcW w:w="2170" w:type="dxa"/>
           </w:tcPr>
           <w:p>
             <w:r>
@@ -1819,6 +2079,22 @@
               </w:rPr>
               <w:t>6 a 11 de la mañana</w:t>
             </w:r>
+          </w:p>
+        </w:tc>
+        <w:tc>
+          <w:tcPr>
+            <w:tcW w:w="2588" w:type="dxa"/>
+          </w:tcPr>
+          <w:p>
+            <w:pPr>
+              <w:spacing w:after="0" w:line="240" w:lineRule="auto"/>
+              <w:jc w:val="both"/>
+              <w:rPr>
+                <w:rFonts w:ascii="Times New Roman" w:hAnsi="Times New Roman" w:cs="Times New Roman"/>
+                <w:sz w:val="24"/>
+                <w:szCs w:val="24"/>
+              </w:rPr>
+            </w:pPr>
           </w:p>
         </w:tc>
       </w:tr>
@@ -1838,7 +2114,7 @@
         </w:tc>
         <w:tc>
           <w:tcPr>
-            <w:tcW w:w="1423" w:type="dxa"/>
+            <w:tcW w:w="2170" w:type="dxa"/>
           </w:tcPr>
           <w:p>
             <w:r>
@@ -1894,6 +2170,22 @@
               </w:rPr>
               <w:t>6 a 11 de la mañana</w:t>
             </w:r>
+          </w:p>
+        </w:tc>
+        <w:tc>
+          <w:tcPr>
+            <w:tcW w:w="2588" w:type="dxa"/>
+          </w:tcPr>
+          <w:p>
+            <w:pPr>
+              <w:spacing w:after="0" w:line="240" w:lineRule="auto"/>
+              <w:jc w:val="both"/>
+              <w:rPr>
+                <w:rFonts w:ascii="Times New Roman" w:hAnsi="Times New Roman" w:cs="Times New Roman"/>
+                <w:sz w:val="24"/>
+                <w:szCs w:val="24"/>
+              </w:rPr>
+            </w:pPr>
           </w:p>
         </w:tc>
       </w:tr>
@@ -1913,7 +2205,7 @@
         </w:tc>
         <w:tc>
           <w:tcPr>
-            <w:tcW w:w="1423" w:type="dxa"/>
+            <w:tcW w:w="2170" w:type="dxa"/>
           </w:tcPr>
           <w:p>
             <w:r>
@@ -1969,6 +2261,22 @@
               </w:rPr>
               <w:t>6 a 11 de la mañana</w:t>
             </w:r>
+          </w:p>
+        </w:tc>
+        <w:tc>
+          <w:tcPr>
+            <w:tcW w:w="2588" w:type="dxa"/>
+          </w:tcPr>
+          <w:p>
+            <w:pPr>
+              <w:spacing w:after="0" w:line="240" w:lineRule="auto"/>
+              <w:jc w:val="both"/>
+              <w:rPr>
+                <w:rFonts w:ascii="Times New Roman" w:hAnsi="Times New Roman" w:cs="Times New Roman"/>
+                <w:sz w:val="24"/>
+                <w:szCs w:val="24"/>
+              </w:rPr>
+            </w:pPr>
           </w:p>
         </w:tc>
       </w:tr>
@@ -1988,7 +2296,7 @@
         </w:tc>
         <w:tc>
           <w:tcPr>
-            <w:tcW w:w="1423" w:type="dxa"/>
+            <w:tcW w:w="2170" w:type="dxa"/>
           </w:tcPr>
           <w:p>
             <w:r>
@@ -2044,6 +2352,22 @@
               </w:rPr>
               <w:t>6 a 11 de la mañana</w:t>
             </w:r>
+          </w:p>
+        </w:tc>
+        <w:tc>
+          <w:tcPr>
+            <w:tcW w:w="2588" w:type="dxa"/>
+          </w:tcPr>
+          <w:p>
+            <w:pPr>
+              <w:spacing w:after="0" w:line="240" w:lineRule="auto"/>
+              <w:jc w:val="both"/>
+              <w:rPr>
+                <w:rFonts w:ascii="Times New Roman" w:hAnsi="Times New Roman" w:cs="Times New Roman"/>
+                <w:sz w:val="24"/>
+                <w:szCs w:val="24"/>
+              </w:rPr>
+            </w:pPr>
           </w:p>
         </w:tc>
       </w:tr>
@@ -2063,7 +2387,7 @@
         </w:tc>
         <w:tc>
           <w:tcPr>
-            <w:tcW w:w="1423" w:type="dxa"/>
+            <w:tcW w:w="2170" w:type="dxa"/>
           </w:tcPr>
           <w:p>
             <w:r>
@@ -2102,6 +2426,20 @@
               </w:rPr>
               <w:t>6 a 11 de la mañana</w:t>
             </w:r>
+          </w:p>
+        </w:tc>
+        <w:tc>
+          <w:tcPr>
+            <w:tcW w:w="2588" w:type="dxa"/>
+          </w:tcPr>
+          <w:p>
+            <w:pPr>
+              <w:rPr>
+                <w:rFonts w:ascii="Times New Roman" w:hAnsi="Times New Roman" w:cs="Times New Roman"/>
+                <w:sz w:val="24"/>
+                <w:szCs w:val="24"/>
+              </w:rPr>
+            </w:pPr>
           </w:p>
         </w:tc>
       </w:tr>
@@ -2121,7 +2459,7 @@
         </w:tc>
         <w:tc>
           <w:tcPr>
-            <w:tcW w:w="1423" w:type="dxa"/>
+            <w:tcW w:w="2170" w:type="dxa"/>
           </w:tcPr>
           <w:p>
             <w:r>
@@ -2160,6 +2498,20 @@
               </w:rPr>
               <w:t>6 a 11 de la mañana</w:t>
             </w:r>
+          </w:p>
+        </w:tc>
+        <w:tc>
+          <w:tcPr>
+            <w:tcW w:w="2588" w:type="dxa"/>
+          </w:tcPr>
+          <w:p>
+            <w:pPr>
+              <w:rPr>
+                <w:rFonts w:ascii="Times New Roman" w:hAnsi="Times New Roman" w:cs="Times New Roman"/>
+                <w:sz w:val="24"/>
+                <w:szCs w:val="24"/>
+              </w:rPr>
+            </w:pPr>
           </w:p>
         </w:tc>
       </w:tr>
@@ -2897,6 +3249,17 @@
                 <w:lang w:val="es-MX"/>
               </w:rPr>
             </w:pPr>
+            <w:proofErr w:type="spellStart"/>
+            <w:r>
+              <w:rPr>
+                <w:rFonts w:ascii="Times New Roman" w:hAnsi="Times New Roman" w:cs="Times New Roman"/>
+                <w:sz w:val="24"/>
+                <w:szCs w:val="24"/>
+                <w:lang w:val="es-MX"/>
+              </w:rPr>
+              <w:t>rectoria@ie</w:t>
+            </w:r>
+            <w:proofErr w:type="spellEnd"/>
           </w:p>
         </w:tc>
         <w:tc>
@@ -3416,18 +3779,17 @@
       <w:pPr>
         <w:spacing w:after="0" w:line="240" w:lineRule="auto"/>
         <w:contextualSpacing/>
-        <w:jc w:val="both"/>
-        <w:rPr>
-          <w:rFonts w:ascii="Times New Roman" w:hAnsi="Times New Roman" w:cs="Times New Roman"/>
-          <w:b/>
-          <w:sz w:val="24"/>
-          <w:szCs w:val="24"/>
-          <w:lang w:val="es-MX"/>
-        </w:rPr>
-      </w:pPr>
-      <w:r>
-        <w:rPr>
-          <w:rFonts w:ascii="Times New Roman" w:hAnsi="Times New Roman" w:cs="Times New Roman"/>
+        <w:rPr>
+          <w:rFonts w:ascii="Arial" w:hAnsi="Arial" w:cs="Arial"/>
+          <w:b/>
+          <w:sz w:val="24"/>
+          <w:szCs w:val="24"/>
+          <w:lang w:val="es-MX"/>
+        </w:rPr>
+      </w:pPr>
+      <w:r>
+        <w:rPr>
+          <w:rFonts w:ascii="Arial" w:hAnsi="Arial" w:cs="Arial"/>
           <w:b/>
           <w:sz w:val="24"/>
           <w:szCs w:val="24"/>
@@ -3440,17 +3802,16 @@
       <w:pPr>
         <w:spacing w:after="0" w:line="240" w:lineRule="auto"/>
         <w:contextualSpacing/>
-        <w:jc w:val="both"/>
-        <w:rPr>
-          <w:rFonts w:ascii="Times New Roman" w:hAnsi="Times New Roman" w:cs="Times New Roman"/>
-          <w:b/>
-          <w:sz w:val="24"/>
-          <w:szCs w:val="24"/>
-        </w:rPr>
-      </w:pPr>
-      <w:r>
-        <w:rPr>
-          <w:rFonts w:ascii="Times New Roman" w:hAnsi="Times New Roman" w:cs="Times New Roman"/>
+        <w:rPr>
+          <w:rFonts w:ascii="Arial" w:hAnsi="Arial" w:cs="Arial"/>
+          <w:b/>
+          <w:sz w:val="24"/>
+          <w:szCs w:val="24"/>
+        </w:rPr>
+      </w:pPr>
+      <w:r>
+        <w:rPr>
+          <w:rFonts w:ascii="Arial" w:hAnsi="Arial" w:cs="Arial"/>
           <w:b/>
           <w:sz w:val="24"/>
           <w:szCs w:val="24"/>
@@ -3462,17 +3823,37 @@
       <w:pPr>
         <w:spacing w:after="0" w:line="240" w:lineRule="auto"/>
         <w:contextualSpacing/>
-        <w:jc w:val="both"/>
-        <w:rPr>
-          <w:rFonts w:ascii="Times New Roman" w:hAnsi="Times New Roman" w:cs="Times New Roman"/>
-          <w:b/>
-          <w:sz w:val="24"/>
-          <w:szCs w:val="24"/>
-        </w:rPr>
-      </w:pPr>
-      <w:r>
-        <w:rPr>
-          <w:rFonts w:ascii="Times New Roman" w:hAnsi="Times New Roman" w:cs="Times New Roman"/>
+        <w:rPr>
+          <w:rFonts w:ascii="Arial" w:hAnsi="Arial" w:cs="Arial"/>
+          <w:b/>
+          <w:sz w:val="24"/>
+          <w:szCs w:val="24"/>
+        </w:rPr>
+      </w:pPr>
+      <w:r>
+        <w:rPr>
+          <w:rFonts w:ascii="Arial" w:hAnsi="Arial" w:cs="Arial"/>
+          <w:b/>
+          <w:sz w:val="24"/>
+          <w:szCs w:val="24"/>
+        </w:rPr>
+        <w:t>- Caracterizar</w:t>
+      </w:r>
+    </w:p>
+    <w:p>
+      <w:pPr>
+        <w:spacing w:after="0" w:line="240" w:lineRule="auto"/>
+        <w:contextualSpacing/>
+        <w:rPr>
+          <w:rFonts w:ascii="Arial" w:hAnsi="Arial" w:cs="Arial"/>
+          <w:b/>
+          <w:sz w:val="24"/>
+          <w:szCs w:val="24"/>
+        </w:rPr>
+      </w:pPr>
+      <w:r>
+        <w:rPr>
+          <w:rFonts w:ascii="Arial" w:hAnsi="Arial" w:cs="Arial"/>
           <w:b/>
           <w:sz w:val="24"/>
           <w:szCs w:val="24"/>
@@ -3481,7 +3862,7 @@
       </w:r>
       <w:r>
         <w:rPr>
-          <w:rFonts w:ascii="Times New Roman" w:hAnsi="Times New Roman" w:cs="Times New Roman"/>
+          <w:rFonts w:ascii="Arial" w:hAnsi="Arial" w:cs="Arial"/>
           <w:b/>
           <w:sz w:val="24"/>
           <w:szCs w:val="24"/>
@@ -3490,7 +3871,7 @@
       </w:r>
       <w:r>
         <w:rPr>
-          <w:rFonts w:ascii="Times New Roman" w:hAnsi="Times New Roman" w:cs="Times New Roman"/>
+          <w:rFonts w:ascii="Arial" w:hAnsi="Arial" w:cs="Arial"/>
           <w:b/>
           <w:bCs/>
           <w:sz w:val="24"/>
@@ -3500,7 +3881,7 @@
       </w:r>
       <w:r>
         <w:rPr>
-          <w:rFonts w:ascii="Times New Roman" w:hAnsi="Times New Roman" w:cs="Times New Roman"/>
+          <w:rFonts w:ascii="Arial" w:hAnsi="Arial" w:cs="Arial"/>
           <w:b/>
           <w:sz w:val="24"/>
           <w:szCs w:val="24"/>
@@ -3514,15 +3895,15 @@
         <w:contextualSpacing/>
         <w:jc w:val="both"/>
         <w:rPr>
-          <w:rFonts w:ascii="Times New Roman" w:hAnsi="Times New Roman" w:cs="Times New Roman"/>
-          <w:b/>
-          <w:sz w:val="24"/>
-          <w:szCs w:val="24"/>
-        </w:rPr>
-      </w:pPr>
-      <w:r>
-        <w:rPr>
-          <w:rFonts w:ascii="Times New Roman" w:hAnsi="Times New Roman" w:cs="Times New Roman"/>
+          <w:rFonts w:ascii="Arial" w:hAnsi="Arial" w:cs="Arial"/>
+          <w:b/>
+          <w:sz w:val="24"/>
+          <w:szCs w:val="24"/>
+        </w:rPr>
+      </w:pPr>
+      <w:r>
+        <w:rPr>
+          <w:rFonts w:ascii="Arial" w:hAnsi="Arial" w:cs="Arial"/>
           <w:b/>
           <w:sz w:val="24"/>
           <w:szCs w:val="24"/>
@@ -3531,39 +3912,57 @@
       </w:r>
       <w:r>
         <w:rPr>
-          <w:rFonts w:ascii="Times New Roman" w:hAnsi="Times New Roman" w:cs="Times New Roman"/>
-          <w:b/>
-          <w:bCs/>
-          <w:sz w:val="24"/>
-          <w:szCs w:val="24"/>
-        </w:rPr>
-        <w:t>**Promover la resolución de problemas matemáticos**</w:t>
-      </w:r>
-      <w:r>
-        <w:rPr>
-          <w:rFonts w:ascii="Times New Roman" w:hAnsi="Times New Roman" w:cs="Times New Roman"/>
-          <w:b/>
-          <w:sz w:val="24"/>
-          <w:szCs w:val="24"/>
-        </w:rPr>
-        <w:t xml:space="preserve"> contextualizados en la realidad rural de Caucasia-Antioquia.  </w:t>
-      </w:r>
-    </w:p>
-    <w:p>
-      <w:pPr>
-        <w:spacing w:after="0" w:line="240" w:lineRule="auto"/>
-        <w:contextualSpacing/>
-        <w:jc w:val="both"/>
-        <w:rPr>
-          <w:rFonts w:ascii="Times New Roman" w:hAnsi="Times New Roman" w:cs="Times New Roman"/>
-          <w:b/>
-          <w:sz w:val="24"/>
-          <w:szCs w:val="24"/>
-        </w:rPr>
-      </w:pPr>
-      <w:r>
-        <w:rPr>
-          <w:rFonts w:ascii="Times New Roman" w:hAnsi="Times New Roman" w:cs="Times New Roman"/>
+          <w:rFonts w:ascii="Arial" w:hAnsi="Arial" w:cs="Arial"/>
+          <w:b/>
+          <w:bCs/>
+          <w:sz w:val="24"/>
+          <w:szCs w:val="24"/>
+        </w:rPr>
+        <w:t>Promover la resolución de problemas matemáticos</w:t>
+      </w:r>
+      <w:r>
+        <w:rPr>
+          <w:rFonts w:ascii="Arial" w:hAnsi="Arial" w:cs="Arial"/>
+          <w:b/>
+          <w:sz w:val="24"/>
+          <w:szCs w:val="24"/>
+        </w:rPr>
+        <w:t xml:space="preserve"> contextualizados en la realidad rural</w:t>
+      </w:r>
+      <w:r>
+        <w:rPr>
+          <w:rFonts w:ascii="Arial" w:hAnsi="Arial" w:cs="Arial"/>
+          <w:b/>
+          <w:sz w:val="24"/>
+          <w:szCs w:val="24"/>
+        </w:rPr>
+        <w:t xml:space="preserve"> y urbana</w:t>
+      </w:r>
+      <w:r>
+        <w:rPr>
+          <w:rFonts w:ascii="Arial" w:hAnsi="Arial" w:cs="Arial"/>
+          <w:b/>
+          <w:sz w:val="24"/>
+          <w:szCs w:val="24"/>
+        </w:rPr>
+        <w:t xml:space="preserve"> de Caucasia-Antioquia.  </w:t>
+      </w:r>
+    </w:p>
+    <w:p>
+      <w:pPr>
+        <w:spacing w:after="0" w:line="240" w:lineRule="auto"/>
+        <w:contextualSpacing/>
+        <w:jc w:val="both"/>
+        <w:rPr>
+          <w:rFonts w:ascii="Arial" w:hAnsi="Arial" w:cs="Arial"/>
+          <w:b/>
+          <w:sz w:val="24"/>
+          <w:szCs w:val="24"/>
+        </w:rPr>
+      </w:pPr>
+      <w:r>
+        <w:rPr>
+          <w:rFonts w:ascii="Arial" w:hAnsi="Arial" w:cs="Arial"/>
           <w:b/>
           <w:sz w:val="24"/>
           <w:szCs w:val="24"/>
@@ -3572,17 +3971,17 @@
       </w:r>
       <w:r>
         <w:rPr>
-          <w:rFonts w:ascii="Times New Roman" w:hAnsi="Times New Roman" w:cs="Times New Roman"/>
-          <w:b/>
-          <w:bCs/>
-          <w:sz w:val="24"/>
-          <w:szCs w:val="24"/>
-        </w:rPr>
-        <w:t>**Fortalecer competencias matemáticas**</w:t>
-      </w:r>
-      <w:r>
-        <w:rPr>
-          <w:rFonts w:ascii="Times New Roman" w:hAnsi="Times New Roman" w:cs="Times New Roman"/>
+          <w:rFonts w:ascii="Arial" w:hAnsi="Arial" w:cs="Arial"/>
+          <w:b/>
+          <w:bCs/>
+          <w:sz w:val="24"/>
+          <w:szCs w:val="24"/>
+        </w:rPr>
+        <w:t>Fortalecer competencias matemáticas**</w:t>
+      </w:r>
+      <w:r>
+        <w:rPr>
+          <w:rFonts w:ascii="Arial" w:hAnsi="Arial" w:cs="Arial"/>
           <w:b/>
           <w:sz w:val="24"/>
           <w:szCs w:val="24"/>
@@ -3619,7 +4018,7 @@
           <w:sz w:val="24"/>
           <w:szCs w:val="24"/>
         </w:rPr>
-        <w:t>**Reflexionar sobre las prácticas pedagógicas**</w:t>
+        <w:t>Reflexionar sobre las prácticas pedagógicas</w:t>
       </w:r>
       <w:r>
         <w:rPr>
@@ -5248,17 +5647,44 @@
     <w:p>
       <w:pPr>
         <w:jc w:val="center"/>
-        <w:rPr>
-          <w:rFonts w:ascii="Times New Roman" w:hAnsi="Times New Roman" w:cs="Times New Roman"/>
-          <w:sz w:val="24"/>
-          <w:szCs w:val="24"/>
-        </w:rPr>
       </w:pPr>
       <w:r>
         <w:rPr>
           <w:highlight w:val="yellow"/>
         </w:rPr>
         <w:t>Correo electrónico</w:t>
+      </w:r>
+    </w:p>
+    <w:p>
+      <w:pPr>
+        <w:jc w:val="center"/>
+      </w:pPr>
+    </w:p>
+    <w:p>
+      <w:pPr>
+        <w:jc w:val="center"/>
+      </w:pPr>
+    </w:p>
+    <w:p>
+      <w:pPr>
+        <w:jc w:val="center"/>
+        <w:rPr>
+          <w:rFonts w:ascii="Times New Roman" w:hAnsi="Times New Roman" w:cs="Times New Roman"/>
+          <w:sz w:val="24"/>
+          <w:szCs w:val="24"/>
+        </w:rPr>
+      </w:pPr>
+      <w:r>
+        <w:t xml:space="preserve">Agregar formato de asistencia de los practicantes al </w:t>
+      </w:r>
+      <w:r>
+        <w:rPr>
+          <w:u w:val="single"/>
+        </w:rPr>
+        <w:t>Centro</w:t>
+      </w:r>
+      <w:r>
+        <w:t xml:space="preserve"> de práctica. </w:t>
       </w:r>
     </w:p>
     <w:sectPr>
@@ -6183,6 +6609,7 @@
   <w:style w:type="character" w:default="1" w:styleId="Fuentedeprrafopredeter">
     <w:name w:val="Default Paragraph Font"/>
     <w:uiPriority w:val="1"/>
+    <w:semiHidden/>
     <w:unhideWhenUsed/>
   </w:style>
   <w:style w:type="table" w:default="1" w:styleId="Tablanormal">
@@ -6786,6 +7213,10 @@
 </file>
 
 <file path=customXml/item1.xml><?xml version="1.0" encoding="utf-8"?>
+<b:Sources xmlns:b="http://schemas.openxmlformats.org/officeDocument/2006/bibliography" xmlns="http://schemas.openxmlformats.org/officeDocument/2006/bibliography" SelectedStyle="/APA.XSL" StyleName="APA"/>
+</file>
+
+<file path=customXml/item2.xml><?xml version="1.0" encoding="utf-8"?>
 <s:customData xmlns="http://www.wps.cn/officeDocument/2013/wpsCustomData" xmlns:s="http://www.wps.cn/officeDocument/2013/wpsCustomData">
   <customSectProps/>
   <customShpExts>
@@ -6795,22 +7226,18 @@
 </s:customData>
 </file>
 
-<file path=customXml/item2.xml><?xml version="1.0" encoding="utf-8"?>
-<b:Sources xmlns:b="http://schemas.openxmlformats.org/officeDocument/2006/bibliography" xmlns="http://schemas.openxmlformats.org/officeDocument/2006/bibliography" SelectedStyle="/APA.XSL" StyleName="APA"/>
+<file path=customXml/itemProps1.xml><?xml version="1.0" encoding="utf-8"?>
+<ds:datastoreItem xmlns:ds="http://schemas.openxmlformats.org/officeDocument/2006/customXml" ds:itemID="{2D82C844-1AE0-44AC-90E9-92968CB8230D}">
+  <ds:schemaRefs>
+    <ds:schemaRef ds:uri="http://schemas.openxmlformats.org/officeDocument/2006/bibliography"/>
+  </ds:schemaRefs>
+</ds:datastoreItem>
 </file>
 
-<file path=customXml/itemProps1.xml><?xml version="1.0" encoding="utf-8"?>
+<file path=customXml/itemProps2.xml><?xml version="1.0" encoding="utf-8"?>
 <ds:datastoreItem xmlns:ds="http://schemas.openxmlformats.org/officeDocument/2006/customXml" ds:itemID="{B1977F7D-205B-4081-913C-38D41E755F92}">
   <ds:schemaRefs>
     <ds:schemaRef ds:uri="http://www.wps.cn/officeDocument/2013/wpsCustomData"/>
   </ds:schemaRefs>
 </ds:datastoreItem>
-</file>
-
-<file path=customXml/itemProps2.xml><?xml version="1.0" encoding="utf-8"?>
-<ds:datastoreItem xmlns:ds="http://schemas.openxmlformats.org/officeDocument/2006/customXml" ds:itemID="{2D82C844-1AE0-44AC-90E9-92968CB8230D}">
-  <ds:schemaRefs>
-    <ds:schemaRef ds:uri="http://schemas.openxmlformats.org/officeDocument/2006/bibliography"/>
-  </ds:schemaRefs>
-</ds:datastoreItem>
 </file>
</xml_diff>

<commit_message>
clase sobre pensamientos matamáticos lista.
</commit_message>
<xml_diff>
--- a/clases_2025_1/1_documentos_actas/2_Acta de inicio cursos práctica 2025-1.docx
+++ b/clases_2025_1/1_documentos_actas/2_Acta de inicio cursos práctica 2025-1.docx
@@ -42,7 +42,6 @@
           <w:b/>
           <w:sz w:val="24"/>
           <w:szCs w:val="24"/>
-          <w:highlight w:val="yellow"/>
           <w:lang w:val="es-MX"/>
         </w:rPr>
         <w:t xml:space="preserve">Y </w:t>
@@ -53,7 +52,6 @@
           <w:b/>
           <w:sz w:val="24"/>
           <w:szCs w:val="24"/>
-          <w:highlight w:val="yellow"/>
           <w:lang w:val="es-ES"/>
         </w:rPr>
         <w:t xml:space="preserve">I.E. LICEO CAUCASIA </w:t>
@@ -86,10 +84,41 @@
           <w:b/>
           <w:sz w:val="24"/>
           <w:szCs w:val="24"/>
-          <w:highlight w:val="yellow"/>
-          <w:lang w:val="es-MX"/>
-        </w:rPr>
-        <w:t>Código del Convenio:</w:t>
+          <w:lang w:val="es-MX"/>
+        </w:rPr>
+        <w:t xml:space="preserve">Código del </w:t>
+      </w:r>
+      <w:proofErr w:type="gramStart"/>
+      <w:r>
+        <w:rPr>
+          <w:rFonts w:ascii="Times New Roman" w:hAnsi="Times New Roman" w:cs="Times New Roman"/>
+          <w:b/>
+          <w:sz w:val="24"/>
+          <w:szCs w:val="24"/>
+          <w:lang w:val="es-MX"/>
+        </w:rPr>
+        <w:t>Convenio:</w:t>
+      </w:r>
+      <w:r>
+        <w:rPr>
+          <w:rFonts w:ascii="Times New Roman" w:hAnsi="Times New Roman" w:cs="Times New Roman"/>
+          <w:b/>
+          <w:sz w:val="24"/>
+          <w:szCs w:val="24"/>
+          <w:lang w:val="es-MX"/>
+        </w:rPr>
+        <w:t>VDPA</w:t>
+      </w:r>
+      <w:proofErr w:type="gramEnd"/>
+      <w:r>
+        <w:rPr>
+          <w:rFonts w:ascii="Times New Roman" w:hAnsi="Times New Roman" w:cs="Times New Roman"/>
+          <w:b/>
+          <w:sz w:val="24"/>
+          <w:szCs w:val="24"/>
+          <w:lang w:val="es-MX"/>
+        </w:rPr>
+        <w:t>-046/2021</w:t>
       </w:r>
     </w:p>
     <w:p>
@@ -321,6 +350,8 @@
         <w:jc w:val="both"/>
         <w:rPr>
           <w:rFonts w:ascii="Times New Roman" w:hAnsi="Times New Roman"/>
+          <w:b/>
+          <w:bCs/>
           <w:iCs/>
           <w:sz w:val="24"/>
           <w:szCs w:val="24"/>
@@ -339,6 +370,8 @@
       <w:r>
         <w:rPr>
           <w:rFonts w:ascii="Times New Roman" w:hAnsi="Times New Roman"/>
+          <w:b/>
+          <w:bCs/>
           <w:sz w:val="24"/>
           <w:szCs w:val="24"/>
           <w:lang w:val="es-ES"/>
@@ -383,6 +416,8 @@
       <w:r>
         <w:rPr>
           <w:rFonts w:ascii="Times New Roman" w:hAnsi="Times New Roman"/>
+          <w:b/>
+          <w:bCs/>
           <w:sz w:val="24"/>
           <w:szCs w:val="24"/>
           <w:lang w:val="es-ES"/>
@@ -522,14 +557,62 @@
       <w:r>
         <w:rPr>
           <w:rFonts w:ascii="Times New Roman" w:hAnsi="Times New Roman"/>
-          <w:b/>
-          <w:bCs/>
           <w:iCs/>
           <w:sz w:val="24"/>
           <w:szCs w:val="24"/>
           <w:lang w:val="es-MX"/>
         </w:rPr>
-        <w:t>31 de mayo de 2025</w:t>
+        <w:t>5</w:t>
+      </w:r>
+      <w:r>
+        <w:rPr>
+          <w:rFonts w:ascii="Times New Roman" w:hAnsi="Times New Roman"/>
+          <w:b/>
+          <w:bCs/>
+          <w:iCs/>
+          <w:sz w:val="24"/>
+          <w:szCs w:val="24"/>
+          <w:lang w:val="es-MX"/>
+        </w:rPr>
+        <w:t xml:space="preserve"> de</w:t>
+      </w:r>
+      <w:r>
+        <w:rPr>
+          <w:rFonts w:ascii="Times New Roman" w:hAnsi="Times New Roman"/>
+          <w:b/>
+          <w:bCs/>
+          <w:iCs/>
+          <w:sz w:val="24"/>
+          <w:szCs w:val="24"/>
+          <w:lang w:val="es-MX"/>
+        </w:rPr>
+        <w:t xml:space="preserve"> </w:t>
+      </w:r>
+      <w:proofErr w:type="gramStart"/>
+      <w:r>
+        <w:rPr>
+          <w:rFonts w:ascii="Times New Roman" w:hAnsi="Times New Roman"/>
+          <w:b/>
+          <w:bCs/>
+          <w:iCs/>
+          <w:sz w:val="24"/>
+          <w:szCs w:val="24"/>
+          <w:lang w:val="es-MX"/>
+        </w:rPr>
+        <w:t>Junio</w:t>
+      </w:r>
+      <w:proofErr w:type="gramEnd"/>
+      <w:r>
+        <w:rPr>
+          <w:rFonts w:ascii="Times New Roman" w:hAnsi="Times New Roman"/>
+          <w:b/>
+          <w:bCs/>
+          <w:iCs/>
+          <w:sz w:val="24"/>
+          <w:szCs w:val="24"/>
+          <w:lang w:val="es-MX"/>
+        </w:rPr>
+        <w:t xml:space="preserve"> de 2025</w:t>
       </w:r>
     </w:p>
     <w:p>
@@ -598,18 +681,20 @@
         <w:jc w:val="both"/>
         <w:rPr>
           <w:rFonts w:ascii="Times New Roman" w:hAnsi="Times New Roman"/>
-          <w:sz w:val="24"/>
-          <w:szCs w:val="24"/>
-          <w:highlight w:val="yellow"/>
-          <w:lang w:val="es-MX"/>
-        </w:rPr>
-      </w:pPr>
-      <w:r>
-        <w:rPr>
-          <w:rFonts w:ascii="Times New Roman" w:hAnsi="Times New Roman"/>
-          <w:sz w:val="24"/>
-          <w:szCs w:val="24"/>
-          <w:highlight w:val="yellow"/>
+          <w:b/>
+          <w:bCs/>
+          <w:sz w:val="24"/>
+          <w:szCs w:val="24"/>
+          <w:lang w:val="es-MX"/>
+        </w:rPr>
+      </w:pPr>
+      <w:r>
+        <w:rPr>
+          <w:rFonts w:ascii="Times New Roman" w:hAnsi="Times New Roman"/>
+          <w:b/>
+          <w:bCs/>
+          <w:sz w:val="24"/>
+          <w:szCs w:val="24"/>
           <w:lang w:val="es-MX"/>
         </w:rPr>
         <w:t>2.1 Datos de los estudiantes</w:t>
@@ -647,7 +732,7 @@
     </w:p>
     <w:tbl>
       <w:tblPr>
-        <w:tblW w:w="12290" w:type="dxa"/>
+        <w:tblW w:w="14700" w:type="dxa"/>
         <w:jc w:val="center"/>
         <w:tblBorders>
           <w:top w:val="single" w:sz="4" w:space="0" w:color="auto"/>
@@ -660,11 +745,12 @@
         <w:tblLook w:val="04A0" w:firstRow="1" w:lastRow="0" w:firstColumn="1" w:lastColumn="0" w:noHBand="0" w:noVBand="1"/>
       </w:tblPr>
       <w:tblGrid>
-        <w:gridCol w:w="3003"/>
-        <w:gridCol w:w="2170"/>
-        <w:gridCol w:w="1941"/>
-        <w:gridCol w:w="2588"/>
-        <w:gridCol w:w="2588"/>
+        <w:gridCol w:w="2784"/>
+        <w:gridCol w:w="2168"/>
+        <w:gridCol w:w="1709"/>
+        <w:gridCol w:w="3219"/>
+        <w:gridCol w:w="2410"/>
+        <w:gridCol w:w="2410"/>
       </w:tblGrid>
       <w:tr>
         <w:trPr>
@@ -672,7 +758,7 @@
         </w:trPr>
         <w:tc>
           <w:tcPr>
-            <w:tcW w:w="3003" w:type="dxa"/>
+            <w:tcW w:w="2784" w:type="dxa"/>
             <w:shd w:val="clear" w:color="auto" w:fill="EAF1DD"/>
           </w:tcPr>
           <w:p>
@@ -703,7 +789,7 @@
         </w:tc>
         <w:tc>
           <w:tcPr>
-            <w:tcW w:w="2170" w:type="dxa"/>
+            <w:tcW w:w="2168" w:type="dxa"/>
             <w:shd w:val="clear" w:color="auto" w:fill="EAF1DD"/>
           </w:tcPr>
           <w:p>
@@ -734,7 +820,7 @@
         </w:tc>
         <w:tc>
           <w:tcPr>
-            <w:tcW w:w="1941" w:type="dxa"/>
+            <w:tcW w:w="1709" w:type="dxa"/>
             <w:shd w:val="clear" w:color="auto" w:fill="EAF1DD"/>
           </w:tcPr>
           <w:p>
@@ -765,7 +851,7 @@
         </w:tc>
         <w:tc>
           <w:tcPr>
-            <w:tcW w:w="2588" w:type="dxa"/>
+            <w:tcW w:w="3219" w:type="dxa"/>
             <w:shd w:val="clear" w:color="auto" w:fill="EAF1DD"/>
           </w:tcPr>
           <w:p>
@@ -795,7 +881,36 @@
         </w:tc>
         <w:tc>
           <w:tcPr>
-            <w:tcW w:w="2588" w:type="dxa"/>
+            <w:tcW w:w="2410" w:type="dxa"/>
+            <w:shd w:val="clear" w:color="auto" w:fill="EAF1DD"/>
+          </w:tcPr>
+          <w:p>
+            <w:pPr>
+              <w:pStyle w:val="Prrafodelista"/>
+              <w:spacing w:after="0" w:line="240" w:lineRule="auto"/>
+              <w:ind w:left="0"/>
+              <w:jc w:val="both"/>
+              <w:rPr>
+                <w:rFonts w:ascii="Times New Roman" w:hAnsi="Times New Roman"/>
+                <w:sz w:val="24"/>
+                <w:szCs w:val="24"/>
+                <w:lang w:val="es-CO"/>
+              </w:rPr>
+            </w:pPr>
+            <w:r>
+              <w:rPr>
+                <w:rFonts w:ascii="Times New Roman" w:hAnsi="Times New Roman"/>
+                <w:sz w:val="24"/>
+                <w:szCs w:val="24"/>
+                <w:lang w:val="es-CO"/>
+              </w:rPr>
+              <w:t xml:space="preserve">Grado asignado </w:t>
+            </w:r>
+          </w:p>
+        </w:tc>
+        <w:tc>
+          <w:tcPr>
+            <w:tcW w:w="2410" w:type="dxa"/>
             <w:shd w:val="clear" w:color="auto" w:fill="EAF1DD"/>
           </w:tcPr>
           <w:p>
@@ -819,7 +934,7 @@
                 <w:szCs w:val="24"/>
                 <w:lang w:val="es-CO"/>
               </w:rPr>
-              <w:t>Firma</w:t>
+              <w:t>Firma del estudiante</w:t>
             </w:r>
           </w:p>
         </w:tc>
@@ -830,7 +945,7 @@
         </w:trPr>
         <w:tc>
           <w:tcPr>
-            <w:tcW w:w="3003" w:type="dxa"/>
+            <w:tcW w:w="2784" w:type="dxa"/>
           </w:tcPr>
           <w:p>
             <w:r>
@@ -840,7 +955,7 @@
         </w:tc>
         <w:tc>
           <w:tcPr>
-            <w:tcW w:w="2170" w:type="dxa"/>
+            <w:tcW w:w="2168" w:type="dxa"/>
           </w:tcPr>
           <w:p>
             <w:r>
@@ -850,7 +965,7 @@
         </w:tc>
         <w:tc>
           <w:tcPr>
-            <w:tcW w:w="1941" w:type="dxa"/>
+            <w:tcW w:w="1709" w:type="dxa"/>
           </w:tcPr>
           <w:p>
             <w:pPr>
@@ -876,7 +991,7 @@
         </w:tc>
         <w:tc>
           <w:tcPr>
-            <w:tcW w:w="2588" w:type="dxa"/>
+            <w:tcW w:w="3219" w:type="dxa"/>
           </w:tcPr>
           <w:p>
             <w:pPr>
@@ -900,7 +1015,33 @@
         </w:tc>
         <w:tc>
           <w:tcPr>
-            <w:tcW w:w="2588" w:type="dxa"/>
+            <w:tcW w:w="2410" w:type="dxa"/>
+          </w:tcPr>
+          <w:p>
+            <w:pPr>
+              <w:spacing w:after="0" w:line="240" w:lineRule="auto"/>
+              <w:jc w:val="both"/>
+              <w:rPr>
+                <w:rFonts w:ascii="Times New Roman" w:hAnsi="Times New Roman" w:cs="Times New Roman"/>
+                <w:sz w:val="24"/>
+                <w:szCs w:val="24"/>
+                <w:u w:val="single"/>
+              </w:rPr>
+            </w:pPr>
+            <w:r>
+              <w:rPr>
+                <w:rFonts w:ascii="Times New Roman" w:hAnsi="Times New Roman" w:cs="Times New Roman"/>
+                <w:sz w:val="24"/>
+                <w:szCs w:val="24"/>
+                <w:u w:val="single"/>
+              </w:rPr>
+              <w:t>Tercero</w:t>
+            </w:r>
+          </w:p>
+        </w:tc>
+        <w:tc>
+          <w:tcPr>
+            <w:tcW w:w="2410" w:type="dxa"/>
           </w:tcPr>
           <w:p>
             <w:pPr>
@@ -921,7 +1062,7 @@
         </w:trPr>
         <w:tc>
           <w:tcPr>
-            <w:tcW w:w="3003" w:type="dxa"/>
+            <w:tcW w:w="2784" w:type="dxa"/>
           </w:tcPr>
           <w:p>
             <w:r>
@@ -931,7 +1072,7 @@
         </w:tc>
         <w:tc>
           <w:tcPr>
-            <w:tcW w:w="2170" w:type="dxa"/>
+            <w:tcW w:w="2168" w:type="dxa"/>
           </w:tcPr>
           <w:p>
             <w:r>
@@ -941,7 +1082,7 @@
         </w:tc>
         <w:tc>
           <w:tcPr>
-            <w:tcW w:w="1941" w:type="dxa"/>
+            <w:tcW w:w="1709" w:type="dxa"/>
           </w:tcPr>
           <w:p>
             <w:pPr>
@@ -967,7 +1108,7 @@
         </w:tc>
         <w:tc>
           <w:tcPr>
-            <w:tcW w:w="2588" w:type="dxa"/>
+            <w:tcW w:w="3219" w:type="dxa"/>
           </w:tcPr>
           <w:p>
             <w:pPr>
@@ -991,7 +1132,23 @@
         </w:tc>
         <w:tc>
           <w:tcPr>
-            <w:tcW w:w="2588" w:type="dxa"/>
+            <w:tcW w:w="2410" w:type="dxa"/>
+          </w:tcPr>
+          <w:p>
+            <w:pPr>
+              <w:spacing w:after="0" w:line="240" w:lineRule="auto"/>
+              <w:jc w:val="both"/>
+              <w:rPr>
+                <w:rFonts w:ascii="Times New Roman" w:hAnsi="Times New Roman" w:cs="Times New Roman"/>
+                <w:sz w:val="24"/>
+                <w:szCs w:val="24"/>
+              </w:rPr>
+            </w:pPr>
+          </w:p>
+        </w:tc>
+        <w:tc>
+          <w:tcPr>
+            <w:tcW w:w="2410" w:type="dxa"/>
           </w:tcPr>
           <w:p>
             <w:pPr>
@@ -1012,7 +1169,7 @@
         </w:trPr>
         <w:tc>
           <w:tcPr>
-            <w:tcW w:w="3003" w:type="dxa"/>
+            <w:tcW w:w="2784" w:type="dxa"/>
           </w:tcPr>
           <w:p>
             <w:r>
@@ -1022,7 +1179,7 @@
         </w:tc>
         <w:tc>
           <w:tcPr>
-            <w:tcW w:w="2170" w:type="dxa"/>
+            <w:tcW w:w="2168" w:type="dxa"/>
           </w:tcPr>
           <w:p>
             <w:r>
@@ -1032,7 +1189,7 @@
         </w:tc>
         <w:tc>
           <w:tcPr>
-            <w:tcW w:w="1941" w:type="dxa"/>
+            <w:tcW w:w="1709" w:type="dxa"/>
           </w:tcPr>
           <w:p>
             <w:pPr>
@@ -1058,7 +1215,7 @@
         </w:tc>
         <w:tc>
           <w:tcPr>
-            <w:tcW w:w="2588" w:type="dxa"/>
+            <w:tcW w:w="3219" w:type="dxa"/>
           </w:tcPr>
           <w:p>
             <w:pPr>
@@ -1082,7 +1239,23 @@
         </w:tc>
         <w:tc>
           <w:tcPr>
-            <w:tcW w:w="2588" w:type="dxa"/>
+            <w:tcW w:w="2410" w:type="dxa"/>
+          </w:tcPr>
+          <w:p>
+            <w:pPr>
+              <w:spacing w:after="0" w:line="240" w:lineRule="auto"/>
+              <w:jc w:val="both"/>
+              <w:rPr>
+                <w:rFonts w:ascii="Times New Roman" w:hAnsi="Times New Roman" w:cs="Times New Roman"/>
+                <w:sz w:val="24"/>
+                <w:szCs w:val="24"/>
+              </w:rPr>
+            </w:pPr>
+          </w:p>
+        </w:tc>
+        <w:tc>
+          <w:tcPr>
+            <w:tcW w:w="2410" w:type="dxa"/>
           </w:tcPr>
           <w:p>
             <w:pPr>
@@ -1103,7 +1276,7 @@
         </w:trPr>
         <w:tc>
           <w:tcPr>
-            <w:tcW w:w="3003" w:type="dxa"/>
+            <w:tcW w:w="2784" w:type="dxa"/>
           </w:tcPr>
           <w:p>
             <w:r>
@@ -1113,7 +1286,7 @@
         </w:tc>
         <w:tc>
           <w:tcPr>
-            <w:tcW w:w="2170" w:type="dxa"/>
+            <w:tcW w:w="2168" w:type="dxa"/>
           </w:tcPr>
           <w:p>
             <w:r>
@@ -1123,7 +1296,7 @@
         </w:tc>
         <w:tc>
           <w:tcPr>
-            <w:tcW w:w="1941" w:type="dxa"/>
+            <w:tcW w:w="1709" w:type="dxa"/>
           </w:tcPr>
           <w:p>
             <w:pPr>
@@ -1149,31 +1322,47 @@
         </w:tc>
         <w:tc>
           <w:tcPr>
-            <w:tcW w:w="2588" w:type="dxa"/>
-          </w:tcPr>
-          <w:p>
-            <w:pPr>
-              <w:spacing w:after="0" w:line="240" w:lineRule="auto"/>
-              <w:jc w:val="both"/>
-              <w:rPr>
-                <w:rFonts w:ascii="Times New Roman" w:hAnsi="Times New Roman" w:cs="Times New Roman"/>
-                <w:sz w:val="24"/>
-                <w:szCs w:val="24"/>
-              </w:rPr>
-            </w:pPr>
-            <w:r>
-              <w:rPr>
-                <w:rFonts w:ascii="Times New Roman" w:hAnsi="Times New Roman" w:cs="Times New Roman"/>
-                <w:sz w:val="24"/>
-                <w:szCs w:val="24"/>
-              </w:rPr>
-              <w:t>6 a 11 de la mañana</w:t>
-            </w:r>
-          </w:p>
-        </w:tc>
-        <w:tc>
-          <w:tcPr>
-            <w:tcW w:w="2588" w:type="dxa"/>
+            <w:tcW w:w="3219" w:type="dxa"/>
+          </w:tcPr>
+          <w:p>
+            <w:pPr>
+              <w:spacing w:after="0" w:line="240" w:lineRule="auto"/>
+              <w:jc w:val="both"/>
+              <w:rPr>
+                <w:rFonts w:ascii="Times New Roman" w:hAnsi="Times New Roman" w:cs="Times New Roman"/>
+                <w:sz w:val="24"/>
+                <w:szCs w:val="24"/>
+              </w:rPr>
+            </w:pPr>
+            <w:r>
+              <w:rPr>
+                <w:rFonts w:ascii="Times New Roman" w:hAnsi="Times New Roman" w:cs="Times New Roman"/>
+                <w:sz w:val="24"/>
+                <w:szCs w:val="24"/>
+              </w:rPr>
+              <w:t>Jueves: 6 a 11 de la mañana</w:t>
+            </w:r>
+          </w:p>
+        </w:tc>
+        <w:tc>
+          <w:tcPr>
+            <w:tcW w:w="2410" w:type="dxa"/>
+          </w:tcPr>
+          <w:p>
+            <w:pPr>
+              <w:spacing w:after="0" w:line="240" w:lineRule="auto"/>
+              <w:jc w:val="both"/>
+              <w:rPr>
+                <w:rFonts w:ascii="Times New Roman" w:hAnsi="Times New Roman" w:cs="Times New Roman"/>
+                <w:sz w:val="24"/>
+                <w:szCs w:val="24"/>
+              </w:rPr>
+            </w:pPr>
+          </w:p>
+        </w:tc>
+        <w:tc>
+          <w:tcPr>
+            <w:tcW w:w="2410" w:type="dxa"/>
           </w:tcPr>
           <w:p>
             <w:pPr>
@@ -1194,7 +1383,7 @@
         </w:trPr>
         <w:tc>
           <w:tcPr>
-            <w:tcW w:w="3003" w:type="dxa"/>
+            <w:tcW w:w="2784" w:type="dxa"/>
           </w:tcPr>
           <w:p>
             <w:r>
@@ -1204,7 +1393,7 @@
         </w:tc>
         <w:tc>
           <w:tcPr>
-            <w:tcW w:w="2170" w:type="dxa"/>
+            <w:tcW w:w="2168" w:type="dxa"/>
           </w:tcPr>
           <w:p>
             <w:r>
@@ -1214,7 +1403,7 @@
         </w:tc>
         <w:tc>
           <w:tcPr>
-            <w:tcW w:w="1941" w:type="dxa"/>
+            <w:tcW w:w="1709" w:type="dxa"/>
           </w:tcPr>
           <w:p>
             <w:pPr>
@@ -1240,31 +1429,47 @@
         </w:tc>
         <w:tc>
           <w:tcPr>
-            <w:tcW w:w="2588" w:type="dxa"/>
-          </w:tcPr>
-          <w:p>
-            <w:pPr>
-              <w:spacing w:after="0" w:line="240" w:lineRule="auto"/>
-              <w:jc w:val="both"/>
-              <w:rPr>
-                <w:rFonts w:ascii="Times New Roman" w:hAnsi="Times New Roman" w:cs="Times New Roman"/>
-                <w:sz w:val="24"/>
-                <w:szCs w:val="24"/>
-              </w:rPr>
-            </w:pPr>
-            <w:r>
-              <w:rPr>
-                <w:rFonts w:ascii="Times New Roman" w:hAnsi="Times New Roman" w:cs="Times New Roman"/>
-                <w:sz w:val="24"/>
-                <w:szCs w:val="24"/>
-              </w:rPr>
-              <w:t>6 a 11 de la mañana</w:t>
-            </w:r>
-          </w:p>
-        </w:tc>
-        <w:tc>
-          <w:tcPr>
-            <w:tcW w:w="2588" w:type="dxa"/>
+            <w:tcW w:w="3219" w:type="dxa"/>
+          </w:tcPr>
+          <w:p>
+            <w:pPr>
+              <w:spacing w:after="0" w:line="240" w:lineRule="auto"/>
+              <w:jc w:val="both"/>
+              <w:rPr>
+                <w:rFonts w:ascii="Times New Roman" w:hAnsi="Times New Roman" w:cs="Times New Roman"/>
+                <w:sz w:val="24"/>
+                <w:szCs w:val="24"/>
+              </w:rPr>
+            </w:pPr>
+            <w:r>
+              <w:rPr>
+                <w:rFonts w:ascii="Times New Roman" w:hAnsi="Times New Roman" w:cs="Times New Roman"/>
+                <w:sz w:val="24"/>
+                <w:szCs w:val="24"/>
+              </w:rPr>
+              <w:t>Jueves: 6 a 11 de la mañana</w:t>
+            </w:r>
+          </w:p>
+        </w:tc>
+        <w:tc>
+          <w:tcPr>
+            <w:tcW w:w="2410" w:type="dxa"/>
+          </w:tcPr>
+          <w:p>
+            <w:pPr>
+              <w:spacing w:after="0" w:line="240" w:lineRule="auto"/>
+              <w:jc w:val="both"/>
+              <w:rPr>
+                <w:rFonts w:ascii="Times New Roman" w:hAnsi="Times New Roman" w:cs="Times New Roman"/>
+                <w:sz w:val="24"/>
+                <w:szCs w:val="24"/>
+              </w:rPr>
+            </w:pPr>
+          </w:p>
+        </w:tc>
+        <w:tc>
+          <w:tcPr>
+            <w:tcW w:w="2410" w:type="dxa"/>
           </w:tcPr>
           <w:p>
             <w:pPr>
@@ -1285,7 +1490,7 @@
         </w:trPr>
         <w:tc>
           <w:tcPr>
-            <w:tcW w:w="3003" w:type="dxa"/>
+            <w:tcW w:w="2784" w:type="dxa"/>
           </w:tcPr>
           <w:p>
             <w:r>
@@ -1295,7 +1500,7 @@
         </w:tc>
         <w:tc>
           <w:tcPr>
-            <w:tcW w:w="2170" w:type="dxa"/>
+            <w:tcW w:w="2168" w:type="dxa"/>
           </w:tcPr>
           <w:p>
             <w:r>
@@ -1305,7 +1510,7 @@
         </w:tc>
         <w:tc>
           <w:tcPr>
-            <w:tcW w:w="1941" w:type="dxa"/>
+            <w:tcW w:w="1709" w:type="dxa"/>
           </w:tcPr>
           <w:p>
             <w:pPr>
@@ -1331,31 +1536,47 @@
         </w:tc>
         <w:tc>
           <w:tcPr>
-            <w:tcW w:w="2588" w:type="dxa"/>
-          </w:tcPr>
-          <w:p>
-            <w:pPr>
-              <w:spacing w:after="0" w:line="240" w:lineRule="auto"/>
-              <w:jc w:val="both"/>
-              <w:rPr>
-                <w:rFonts w:ascii="Times New Roman" w:hAnsi="Times New Roman" w:cs="Times New Roman"/>
-                <w:sz w:val="24"/>
-                <w:szCs w:val="24"/>
-              </w:rPr>
-            </w:pPr>
-            <w:r>
-              <w:rPr>
-                <w:rFonts w:ascii="Times New Roman" w:hAnsi="Times New Roman" w:cs="Times New Roman"/>
-                <w:sz w:val="24"/>
-                <w:szCs w:val="24"/>
-              </w:rPr>
-              <w:t>6 a 11 de la mañana</w:t>
-            </w:r>
-          </w:p>
-        </w:tc>
-        <w:tc>
-          <w:tcPr>
-            <w:tcW w:w="2588" w:type="dxa"/>
+            <w:tcW w:w="3219" w:type="dxa"/>
+          </w:tcPr>
+          <w:p>
+            <w:pPr>
+              <w:spacing w:after="0" w:line="240" w:lineRule="auto"/>
+              <w:jc w:val="both"/>
+              <w:rPr>
+                <w:rFonts w:ascii="Times New Roman" w:hAnsi="Times New Roman" w:cs="Times New Roman"/>
+                <w:sz w:val="24"/>
+                <w:szCs w:val="24"/>
+              </w:rPr>
+            </w:pPr>
+            <w:r>
+              <w:rPr>
+                <w:rFonts w:ascii="Times New Roman" w:hAnsi="Times New Roman" w:cs="Times New Roman"/>
+                <w:sz w:val="24"/>
+                <w:szCs w:val="24"/>
+              </w:rPr>
+              <w:t>Jueves: 6 a 11 de la mañana</w:t>
+            </w:r>
+          </w:p>
+        </w:tc>
+        <w:tc>
+          <w:tcPr>
+            <w:tcW w:w="2410" w:type="dxa"/>
+          </w:tcPr>
+          <w:p>
+            <w:pPr>
+              <w:spacing w:after="0" w:line="240" w:lineRule="auto"/>
+              <w:jc w:val="both"/>
+              <w:rPr>
+                <w:rFonts w:ascii="Times New Roman" w:hAnsi="Times New Roman" w:cs="Times New Roman"/>
+                <w:sz w:val="24"/>
+                <w:szCs w:val="24"/>
+              </w:rPr>
+            </w:pPr>
+          </w:p>
+        </w:tc>
+        <w:tc>
+          <w:tcPr>
+            <w:tcW w:w="2410" w:type="dxa"/>
           </w:tcPr>
           <w:p>
             <w:pPr>
@@ -1376,7 +1597,7 @@
         </w:trPr>
         <w:tc>
           <w:tcPr>
-            <w:tcW w:w="3003" w:type="dxa"/>
+            <w:tcW w:w="2784" w:type="dxa"/>
           </w:tcPr>
           <w:p>
             <w:r>
@@ -1386,7 +1607,7 @@
         </w:tc>
         <w:tc>
           <w:tcPr>
-            <w:tcW w:w="2170" w:type="dxa"/>
+            <w:tcW w:w="2168" w:type="dxa"/>
           </w:tcPr>
           <w:p>
             <w:r>
@@ -1396,7 +1617,7 @@
         </w:tc>
         <w:tc>
           <w:tcPr>
-            <w:tcW w:w="1941" w:type="dxa"/>
+            <w:tcW w:w="1709" w:type="dxa"/>
           </w:tcPr>
           <w:p>
             <w:pPr>
@@ -1422,31 +1643,47 @@
         </w:tc>
         <w:tc>
           <w:tcPr>
-            <w:tcW w:w="2588" w:type="dxa"/>
-          </w:tcPr>
-          <w:p>
-            <w:pPr>
-              <w:spacing w:after="0" w:line="240" w:lineRule="auto"/>
-              <w:jc w:val="both"/>
-              <w:rPr>
-                <w:rFonts w:ascii="Times New Roman" w:hAnsi="Times New Roman" w:cs="Times New Roman"/>
-                <w:sz w:val="24"/>
-                <w:szCs w:val="24"/>
-              </w:rPr>
-            </w:pPr>
-            <w:r>
-              <w:rPr>
-                <w:rFonts w:ascii="Times New Roman" w:hAnsi="Times New Roman" w:cs="Times New Roman"/>
-                <w:sz w:val="24"/>
-                <w:szCs w:val="24"/>
-              </w:rPr>
-              <w:t>6 a 11 de la mañana</w:t>
-            </w:r>
-          </w:p>
-        </w:tc>
-        <w:tc>
-          <w:tcPr>
-            <w:tcW w:w="2588" w:type="dxa"/>
+            <w:tcW w:w="3219" w:type="dxa"/>
+          </w:tcPr>
+          <w:p>
+            <w:pPr>
+              <w:spacing w:after="0" w:line="240" w:lineRule="auto"/>
+              <w:jc w:val="both"/>
+              <w:rPr>
+                <w:rFonts w:ascii="Times New Roman" w:hAnsi="Times New Roman" w:cs="Times New Roman"/>
+                <w:sz w:val="24"/>
+                <w:szCs w:val="24"/>
+              </w:rPr>
+            </w:pPr>
+            <w:r>
+              <w:rPr>
+                <w:rFonts w:ascii="Times New Roman" w:hAnsi="Times New Roman" w:cs="Times New Roman"/>
+                <w:sz w:val="24"/>
+                <w:szCs w:val="24"/>
+              </w:rPr>
+              <w:t>Jueves: 6 a 11 de la mañana</w:t>
+            </w:r>
+          </w:p>
+        </w:tc>
+        <w:tc>
+          <w:tcPr>
+            <w:tcW w:w="2410" w:type="dxa"/>
+          </w:tcPr>
+          <w:p>
+            <w:pPr>
+              <w:spacing w:after="0" w:line="240" w:lineRule="auto"/>
+              <w:jc w:val="both"/>
+              <w:rPr>
+                <w:rFonts w:ascii="Times New Roman" w:hAnsi="Times New Roman" w:cs="Times New Roman"/>
+                <w:sz w:val="24"/>
+                <w:szCs w:val="24"/>
+              </w:rPr>
+            </w:pPr>
+          </w:p>
+        </w:tc>
+        <w:tc>
+          <w:tcPr>
+            <w:tcW w:w="2410" w:type="dxa"/>
           </w:tcPr>
           <w:p>
             <w:pPr>
@@ -1467,7 +1704,7 @@
         </w:trPr>
         <w:tc>
           <w:tcPr>
-            <w:tcW w:w="3003" w:type="dxa"/>
+            <w:tcW w:w="2784" w:type="dxa"/>
           </w:tcPr>
           <w:p>
             <w:r>
@@ -1477,7 +1714,7 @@
         </w:tc>
         <w:tc>
           <w:tcPr>
-            <w:tcW w:w="2170" w:type="dxa"/>
+            <w:tcW w:w="2168" w:type="dxa"/>
           </w:tcPr>
           <w:p>
             <w:r>
@@ -1487,7 +1724,7 @@
         </w:tc>
         <w:tc>
           <w:tcPr>
-            <w:tcW w:w="1941" w:type="dxa"/>
+            <w:tcW w:w="1709" w:type="dxa"/>
           </w:tcPr>
           <w:p>
             <w:pPr>
@@ -1513,31 +1750,47 @@
         </w:tc>
         <w:tc>
           <w:tcPr>
-            <w:tcW w:w="2588" w:type="dxa"/>
-          </w:tcPr>
-          <w:p>
-            <w:pPr>
-              <w:spacing w:after="0" w:line="240" w:lineRule="auto"/>
-              <w:jc w:val="both"/>
-              <w:rPr>
-                <w:rFonts w:ascii="Times New Roman" w:hAnsi="Times New Roman" w:cs="Times New Roman"/>
-                <w:sz w:val="24"/>
-                <w:szCs w:val="24"/>
-              </w:rPr>
-            </w:pPr>
-            <w:r>
-              <w:rPr>
-                <w:rFonts w:ascii="Times New Roman" w:hAnsi="Times New Roman" w:cs="Times New Roman"/>
-                <w:sz w:val="24"/>
-                <w:szCs w:val="24"/>
-              </w:rPr>
-              <w:t>6 a 11 de la mañana</w:t>
-            </w:r>
-          </w:p>
-        </w:tc>
-        <w:tc>
-          <w:tcPr>
-            <w:tcW w:w="2588" w:type="dxa"/>
+            <w:tcW w:w="3219" w:type="dxa"/>
+          </w:tcPr>
+          <w:p>
+            <w:pPr>
+              <w:spacing w:after="0" w:line="240" w:lineRule="auto"/>
+              <w:jc w:val="both"/>
+              <w:rPr>
+                <w:rFonts w:ascii="Times New Roman" w:hAnsi="Times New Roman" w:cs="Times New Roman"/>
+                <w:sz w:val="24"/>
+                <w:szCs w:val="24"/>
+              </w:rPr>
+            </w:pPr>
+            <w:r>
+              <w:rPr>
+                <w:rFonts w:ascii="Times New Roman" w:hAnsi="Times New Roman" w:cs="Times New Roman"/>
+                <w:sz w:val="24"/>
+                <w:szCs w:val="24"/>
+              </w:rPr>
+              <w:t>Jueves: 6 a 11 de la mañana</w:t>
+            </w:r>
+          </w:p>
+        </w:tc>
+        <w:tc>
+          <w:tcPr>
+            <w:tcW w:w="2410" w:type="dxa"/>
+          </w:tcPr>
+          <w:p>
+            <w:pPr>
+              <w:spacing w:after="0" w:line="240" w:lineRule="auto"/>
+              <w:jc w:val="both"/>
+              <w:rPr>
+                <w:rFonts w:ascii="Times New Roman" w:hAnsi="Times New Roman" w:cs="Times New Roman"/>
+                <w:sz w:val="24"/>
+                <w:szCs w:val="24"/>
+              </w:rPr>
+            </w:pPr>
+          </w:p>
+        </w:tc>
+        <w:tc>
+          <w:tcPr>
+            <w:tcW w:w="2410" w:type="dxa"/>
           </w:tcPr>
           <w:p>
             <w:pPr>
@@ -1558,7 +1811,7 @@
         </w:trPr>
         <w:tc>
           <w:tcPr>
-            <w:tcW w:w="3003" w:type="dxa"/>
+            <w:tcW w:w="2784" w:type="dxa"/>
           </w:tcPr>
           <w:p>
             <w:r>
@@ -1568,7 +1821,7 @@
         </w:tc>
         <w:tc>
           <w:tcPr>
-            <w:tcW w:w="2170" w:type="dxa"/>
+            <w:tcW w:w="2168" w:type="dxa"/>
           </w:tcPr>
           <w:p>
             <w:r>
@@ -1578,7 +1831,7 @@
         </w:tc>
         <w:tc>
           <w:tcPr>
-            <w:tcW w:w="1941" w:type="dxa"/>
+            <w:tcW w:w="1709" w:type="dxa"/>
           </w:tcPr>
           <w:p>
             <w:pPr>
@@ -1604,31 +1857,47 @@
         </w:tc>
         <w:tc>
           <w:tcPr>
-            <w:tcW w:w="2588" w:type="dxa"/>
-          </w:tcPr>
-          <w:p>
-            <w:pPr>
-              <w:spacing w:after="0" w:line="240" w:lineRule="auto"/>
-              <w:jc w:val="both"/>
-              <w:rPr>
-                <w:rFonts w:ascii="Times New Roman" w:hAnsi="Times New Roman" w:cs="Times New Roman"/>
-                <w:sz w:val="24"/>
-                <w:szCs w:val="24"/>
-              </w:rPr>
-            </w:pPr>
-            <w:r>
-              <w:rPr>
-                <w:rFonts w:ascii="Times New Roman" w:hAnsi="Times New Roman" w:cs="Times New Roman"/>
-                <w:sz w:val="24"/>
-                <w:szCs w:val="24"/>
-              </w:rPr>
-              <w:t>6 a 11 de la mañana</w:t>
-            </w:r>
-          </w:p>
-        </w:tc>
-        <w:tc>
-          <w:tcPr>
-            <w:tcW w:w="2588" w:type="dxa"/>
+            <w:tcW w:w="3219" w:type="dxa"/>
+          </w:tcPr>
+          <w:p>
+            <w:pPr>
+              <w:spacing w:after="0" w:line="240" w:lineRule="auto"/>
+              <w:jc w:val="both"/>
+              <w:rPr>
+                <w:rFonts w:ascii="Times New Roman" w:hAnsi="Times New Roman" w:cs="Times New Roman"/>
+                <w:sz w:val="24"/>
+                <w:szCs w:val="24"/>
+              </w:rPr>
+            </w:pPr>
+            <w:r>
+              <w:rPr>
+                <w:rFonts w:ascii="Times New Roman" w:hAnsi="Times New Roman" w:cs="Times New Roman"/>
+                <w:sz w:val="24"/>
+                <w:szCs w:val="24"/>
+              </w:rPr>
+              <w:t>Jueves: 6 a 11 de la mañana</w:t>
+            </w:r>
+          </w:p>
+        </w:tc>
+        <w:tc>
+          <w:tcPr>
+            <w:tcW w:w="2410" w:type="dxa"/>
+          </w:tcPr>
+          <w:p>
+            <w:pPr>
+              <w:spacing w:after="0" w:line="240" w:lineRule="auto"/>
+              <w:jc w:val="both"/>
+              <w:rPr>
+                <w:rFonts w:ascii="Times New Roman" w:hAnsi="Times New Roman" w:cs="Times New Roman"/>
+                <w:sz w:val="24"/>
+                <w:szCs w:val="24"/>
+              </w:rPr>
+            </w:pPr>
+          </w:p>
+        </w:tc>
+        <w:tc>
+          <w:tcPr>
+            <w:tcW w:w="2410" w:type="dxa"/>
           </w:tcPr>
           <w:p>
             <w:pPr>
@@ -1649,7 +1918,7 @@
         </w:trPr>
         <w:tc>
           <w:tcPr>
-            <w:tcW w:w="3003" w:type="dxa"/>
+            <w:tcW w:w="2784" w:type="dxa"/>
           </w:tcPr>
           <w:p>
             <w:r>
@@ -1659,7 +1928,7 @@
         </w:tc>
         <w:tc>
           <w:tcPr>
-            <w:tcW w:w="2170" w:type="dxa"/>
+            <w:tcW w:w="2168" w:type="dxa"/>
           </w:tcPr>
           <w:p>
             <w:r>
@@ -1669,7 +1938,7 @@
         </w:tc>
         <w:tc>
           <w:tcPr>
-            <w:tcW w:w="1941" w:type="dxa"/>
+            <w:tcW w:w="1709" w:type="dxa"/>
           </w:tcPr>
           <w:p>
             <w:pPr>
@@ -1695,31 +1964,47 @@
         </w:tc>
         <w:tc>
           <w:tcPr>
-            <w:tcW w:w="2588" w:type="dxa"/>
-          </w:tcPr>
-          <w:p>
-            <w:pPr>
-              <w:spacing w:after="0" w:line="240" w:lineRule="auto"/>
-              <w:jc w:val="both"/>
-              <w:rPr>
-                <w:rFonts w:ascii="Times New Roman" w:hAnsi="Times New Roman" w:cs="Times New Roman"/>
-                <w:sz w:val="24"/>
-                <w:szCs w:val="24"/>
-              </w:rPr>
-            </w:pPr>
-            <w:r>
-              <w:rPr>
-                <w:rFonts w:ascii="Times New Roman" w:hAnsi="Times New Roman" w:cs="Times New Roman"/>
-                <w:sz w:val="24"/>
-                <w:szCs w:val="24"/>
-              </w:rPr>
-              <w:t>6 a 11 de la mañana</w:t>
-            </w:r>
-          </w:p>
-        </w:tc>
-        <w:tc>
-          <w:tcPr>
-            <w:tcW w:w="2588" w:type="dxa"/>
+            <w:tcW w:w="3219" w:type="dxa"/>
+          </w:tcPr>
+          <w:p>
+            <w:pPr>
+              <w:spacing w:after="0" w:line="240" w:lineRule="auto"/>
+              <w:jc w:val="both"/>
+              <w:rPr>
+                <w:rFonts w:ascii="Times New Roman" w:hAnsi="Times New Roman" w:cs="Times New Roman"/>
+                <w:sz w:val="24"/>
+                <w:szCs w:val="24"/>
+              </w:rPr>
+            </w:pPr>
+            <w:r>
+              <w:rPr>
+                <w:rFonts w:ascii="Times New Roman" w:hAnsi="Times New Roman" w:cs="Times New Roman"/>
+                <w:sz w:val="24"/>
+                <w:szCs w:val="24"/>
+              </w:rPr>
+              <w:t>Jueves: 6 a 11 de la mañana</w:t>
+            </w:r>
+          </w:p>
+        </w:tc>
+        <w:tc>
+          <w:tcPr>
+            <w:tcW w:w="2410" w:type="dxa"/>
+          </w:tcPr>
+          <w:p>
+            <w:pPr>
+              <w:spacing w:after="0" w:line="240" w:lineRule="auto"/>
+              <w:jc w:val="both"/>
+              <w:rPr>
+                <w:rFonts w:ascii="Times New Roman" w:hAnsi="Times New Roman" w:cs="Times New Roman"/>
+                <w:sz w:val="24"/>
+                <w:szCs w:val="24"/>
+              </w:rPr>
+            </w:pPr>
+          </w:p>
+        </w:tc>
+        <w:tc>
+          <w:tcPr>
+            <w:tcW w:w="2410" w:type="dxa"/>
           </w:tcPr>
           <w:p>
             <w:pPr>
@@ -1740,7 +2025,7 @@
         </w:trPr>
         <w:tc>
           <w:tcPr>
-            <w:tcW w:w="3003" w:type="dxa"/>
+            <w:tcW w:w="2784" w:type="dxa"/>
           </w:tcPr>
           <w:p>
             <w:r>
@@ -1750,7 +2035,7 @@
         </w:tc>
         <w:tc>
           <w:tcPr>
-            <w:tcW w:w="2170" w:type="dxa"/>
+            <w:tcW w:w="2168" w:type="dxa"/>
           </w:tcPr>
           <w:p>
             <w:r>
@@ -1760,7 +2045,7 @@
         </w:tc>
         <w:tc>
           <w:tcPr>
-            <w:tcW w:w="1941" w:type="dxa"/>
+            <w:tcW w:w="1709" w:type="dxa"/>
           </w:tcPr>
           <w:p>
             <w:pPr>
@@ -1786,31 +2071,55 @@
         </w:tc>
         <w:tc>
           <w:tcPr>
-            <w:tcW w:w="2588" w:type="dxa"/>
-          </w:tcPr>
-          <w:p>
-            <w:pPr>
-              <w:spacing w:after="0" w:line="240" w:lineRule="auto"/>
-              <w:jc w:val="both"/>
-              <w:rPr>
-                <w:rFonts w:ascii="Times New Roman" w:hAnsi="Times New Roman" w:cs="Times New Roman"/>
-                <w:sz w:val="24"/>
-                <w:szCs w:val="24"/>
-              </w:rPr>
-            </w:pPr>
-            <w:r>
-              <w:rPr>
-                <w:rFonts w:ascii="Times New Roman" w:hAnsi="Times New Roman" w:cs="Times New Roman"/>
-                <w:sz w:val="24"/>
-                <w:szCs w:val="24"/>
-              </w:rPr>
-              <w:t>6 a 11 de la mañana</w:t>
-            </w:r>
-          </w:p>
-        </w:tc>
-        <w:tc>
-          <w:tcPr>
-            <w:tcW w:w="2588" w:type="dxa"/>
+            <w:tcW w:w="3219" w:type="dxa"/>
+          </w:tcPr>
+          <w:p>
+            <w:pPr>
+              <w:spacing w:after="0" w:line="240" w:lineRule="auto"/>
+              <w:jc w:val="both"/>
+              <w:rPr>
+                <w:rFonts w:ascii="Times New Roman" w:hAnsi="Times New Roman" w:cs="Times New Roman"/>
+                <w:sz w:val="24"/>
+                <w:szCs w:val="24"/>
+              </w:rPr>
+            </w:pPr>
+            <w:r>
+              <w:rPr>
+                <w:rFonts w:ascii="Times New Roman" w:hAnsi="Times New Roman" w:cs="Times New Roman"/>
+                <w:sz w:val="24"/>
+                <w:szCs w:val="24"/>
+              </w:rPr>
+              <w:t>Jueves: 6 a 11 de la mañana</w:t>
+            </w:r>
+          </w:p>
+        </w:tc>
+        <w:tc>
+          <w:tcPr>
+            <w:tcW w:w="2410" w:type="dxa"/>
+          </w:tcPr>
+          <w:p>
+            <w:pPr>
+              <w:spacing w:after="0" w:line="240" w:lineRule="auto"/>
+              <w:jc w:val="both"/>
+              <w:rPr>
+                <w:rFonts w:ascii="Times New Roman" w:hAnsi="Times New Roman" w:cs="Times New Roman"/>
+                <w:sz w:val="24"/>
+                <w:szCs w:val="24"/>
+              </w:rPr>
+            </w:pPr>
+            <w:r>
+              <w:rPr>
+                <w:rFonts w:ascii="Times New Roman" w:hAnsi="Times New Roman" w:cs="Times New Roman"/>
+                <w:sz w:val="24"/>
+                <w:szCs w:val="24"/>
+              </w:rPr>
+              <w:t>Grado Primero</w:t>
+            </w:r>
+          </w:p>
+        </w:tc>
+        <w:tc>
+          <w:tcPr>
+            <w:tcW w:w="2410" w:type="dxa"/>
           </w:tcPr>
           <w:p>
             <w:pPr>
@@ -1831,7 +2140,7 @@
         </w:trPr>
         <w:tc>
           <w:tcPr>
-            <w:tcW w:w="3003" w:type="dxa"/>
+            <w:tcW w:w="2784" w:type="dxa"/>
           </w:tcPr>
           <w:p>
             <w:r>
@@ -1841,7 +2150,7 @@
         </w:tc>
         <w:tc>
           <w:tcPr>
-            <w:tcW w:w="2170" w:type="dxa"/>
+            <w:tcW w:w="2168" w:type="dxa"/>
           </w:tcPr>
           <w:p>
             <w:r>
@@ -1851,7 +2160,7 @@
         </w:tc>
         <w:tc>
           <w:tcPr>
-            <w:tcW w:w="1941" w:type="dxa"/>
+            <w:tcW w:w="1709" w:type="dxa"/>
           </w:tcPr>
           <w:p>
             <w:pPr>
@@ -1877,31 +2186,55 @@
         </w:tc>
         <w:tc>
           <w:tcPr>
-            <w:tcW w:w="2588" w:type="dxa"/>
-          </w:tcPr>
-          <w:p>
-            <w:pPr>
-              <w:spacing w:after="0" w:line="240" w:lineRule="auto"/>
-              <w:jc w:val="both"/>
-              <w:rPr>
-                <w:rFonts w:ascii="Times New Roman" w:hAnsi="Times New Roman" w:cs="Times New Roman"/>
-                <w:sz w:val="24"/>
-                <w:szCs w:val="24"/>
-              </w:rPr>
-            </w:pPr>
-            <w:r>
-              <w:rPr>
-                <w:rFonts w:ascii="Times New Roman" w:hAnsi="Times New Roman" w:cs="Times New Roman"/>
-                <w:sz w:val="24"/>
-                <w:szCs w:val="24"/>
-              </w:rPr>
-              <w:t>6 a 11 de la mañana</w:t>
-            </w:r>
-          </w:p>
-        </w:tc>
-        <w:tc>
-          <w:tcPr>
-            <w:tcW w:w="2588" w:type="dxa"/>
+            <w:tcW w:w="3219" w:type="dxa"/>
+          </w:tcPr>
+          <w:p>
+            <w:pPr>
+              <w:spacing w:after="0" w:line="240" w:lineRule="auto"/>
+              <w:jc w:val="both"/>
+              <w:rPr>
+                <w:rFonts w:ascii="Times New Roman" w:hAnsi="Times New Roman" w:cs="Times New Roman"/>
+                <w:sz w:val="24"/>
+                <w:szCs w:val="24"/>
+              </w:rPr>
+            </w:pPr>
+            <w:r>
+              <w:rPr>
+                <w:rFonts w:ascii="Times New Roman" w:hAnsi="Times New Roman" w:cs="Times New Roman"/>
+                <w:sz w:val="24"/>
+                <w:szCs w:val="24"/>
+              </w:rPr>
+              <w:t>Jueves: 6 a 11 de la mañana</w:t>
+            </w:r>
+          </w:p>
+        </w:tc>
+        <w:tc>
+          <w:tcPr>
+            <w:tcW w:w="2410" w:type="dxa"/>
+          </w:tcPr>
+          <w:p>
+            <w:pPr>
+              <w:spacing w:after="0" w:line="240" w:lineRule="auto"/>
+              <w:jc w:val="both"/>
+              <w:rPr>
+                <w:rFonts w:ascii="Times New Roman" w:hAnsi="Times New Roman" w:cs="Times New Roman"/>
+                <w:sz w:val="24"/>
+                <w:szCs w:val="24"/>
+              </w:rPr>
+            </w:pPr>
+            <w:r>
+              <w:rPr>
+                <w:rFonts w:ascii="Times New Roman" w:hAnsi="Times New Roman" w:cs="Times New Roman"/>
+                <w:sz w:val="24"/>
+                <w:szCs w:val="24"/>
+              </w:rPr>
+              <w:t>Grado Primero</w:t>
+            </w:r>
+          </w:p>
+        </w:tc>
+        <w:tc>
+          <w:tcPr>
+            <w:tcW w:w="2410" w:type="dxa"/>
           </w:tcPr>
           <w:p>
             <w:pPr>
@@ -1922,7 +2255,7 @@
         </w:trPr>
         <w:tc>
           <w:tcPr>
-            <w:tcW w:w="3003" w:type="dxa"/>
+            <w:tcW w:w="2784" w:type="dxa"/>
           </w:tcPr>
           <w:p>
             <w:r>
@@ -1932,7 +2265,7 @@
         </w:tc>
         <w:tc>
           <w:tcPr>
-            <w:tcW w:w="2170" w:type="dxa"/>
+            <w:tcW w:w="2168" w:type="dxa"/>
           </w:tcPr>
           <w:p>
             <w:r>
@@ -1942,7 +2275,7 @@
         </w:tc>
         <w:tc>
           <w:tcPr>
-            <w:tcW w:w="1941" w:type="dxa"/>
+            <w:tcW w:w="1709" w:type="dxa"/>
           </w:tcPr>
           <w:p>
             <w:pPr>
@@ -1968,31 +2301,47 @@
         </w:tc>
         <w:tc>
           <w:tcPr>
-            <w:tcW w:w="2588" w:type="dxa"/>
-          </w:tcPr>
-          <w:p>
-            <w:pPr>
-              <w:spacing w:after="0" w:line="240" w:lineRule="auto"/>
-              <w:jc w:val="both"/>
-              <w:rPr>
-                <w:rFonts w:ascii="Times New Roman" w:hAnsi="Times New Roman" w:cs="Times New Roman"/>
-                <w:sz w:val="24"/>
-                <w:szCs w:val="24"/>
-              </w:rPr>
-            </w:pPr>
-            <w:r>
-              <w:rPr>
-                <w:rFonts w:ascii="Times New Roman" w:hAnsi="Times New Roman" w:cs="Times New Roman"/>
-                <w:sz w:val="24"/>
-                <w:szCs w:val="24"/>
-              </w:rPr>
-              <w:t>6 a 11 de la mañana</w:t>
-            </w:r>
-          </w:p>
-        </w:tc>
-        <w:tc>
-          <w:tcPr>
-            <w:tcW w:w="2588" w:type="dxa"/>
+            <w:tcW w:w="3219" w:type="dxa"/>
+          </w:tcPr>
+          <w:p>
+            <w:pPr>
+              <w:spacing w:after="0" w:line="240" w:lineRule="auto"/>
+              <w:jc w:val="both"/>
+              <w:rPr>
+                <w:rFonts w:ascii="Times New Roman" w:hAnsi="Times New Roman" w:cs="Times New Roman"/>
+                <w:sz w:val="24"/>
+                <w:szCs w:val="24"/>
+              </w:rPr>
+            </w:pPr>
+            <w:r>
+              <w:rPr>
+                <w:rFonts w:ascii="Times New Roman" w:hAnsi="Times New Roman" w:cs="Times New Roman"/>
+                <w:sz w:val="24"/>
+                <w:szCs w:val="24"/>
+              </w:rPr>
+              <w:t>Jueves: 6 a 11 de la mañana</w:t>
+            </w:r>
+          </w:p>
+        </w:tc>
+        <w:tc>
+          <w:tcPr>
+            <w:tcW w:w="2410" w:type="dxa"/>
+          </w:tcPr>
+          <w:p>
+            <w:pPr>
+              <w:spacing w:after="0" w:line="240" w:lineRule="auto"/>
+              <w:jc w:val="both"/>
+              <w:rPr>
+                <w:rFonts w:ascii="Times New Roman" w:hAnsi="Times New Roman" w:cs="Times New Roman"/>
+                <w:sz w:val="24"/>
+                <w:szCs w:val="24"/>
+              </w:rPr>
+            </w:pPr>
+          </w:p>
+        </w:tc>
+        <w:tc>
+          <w:tcPr>
+            <w:tcW w:w="2410" w:type="dxa"/>
           </w:tcPr>
           <w:p>
             <w:pPr>
@@ -2013,7 +2362,7 @@
         </w:trPr>
         <w:tc>
           <w:tcPr>
-            <w:tcW w:w="3003" w:type="dxa"/>
+            <w:tcW w:w="2784" w:type="dxa"/>
           </w:tcPr>
           <w:p>
             <w:r>
@@ -2023,7 +2372,7 @@
         </w:tc>
         <w:tc>
           <w:tcPr>
-            <w:tcW w:w="2170" w:type="dxa"/>
+            <w:tcW w:w="2168" w:type="dxa"/>
           </w:tcPr>
           <w:p>
             <w:r>
@@ -2033,7 +2382,7 @@
         </w:tc>
         <w:tc>
           <w:tcPr>
-            <w:tcW w:w="1941" w:type="dxa"/>
+            <w:tcW w:w="1709" w:type="dxa"/>
           </w:tcPr>
           <w:p>
             <w:pPr>
@@ -2059,31 +2408,47 @@
         </w:tc>
         <w:tc>
           <w:tcPr>
-            <w:tcW w:w="2588" w:type="dxa"/>
-          </w:tcPr>
-          <w:p>
-            <w:pPr>
-              <w:spacing w:after="0" w:line="240" w:lineRule="auto"/>
-              <w:jc w:val="both"/>
-              <w:rPr>
-                <w:rFonts w:ascii="Times New Roman" w:hAnsi="Times New Roman" w:cs="Times New Roman"/>
-                <w:sz w:val="24"/>
-                <w:szCs w:val="24"/>
-              </w:rPr>
-            </w:pPr>
-            <w:r>
-              <w:rPr>
-                <w:rFonts w:ascii="Times New Roman" w:hAnsi="Times New Roman" w:cs="Times New Roman"/>
-                <w:sz w:val="24"/>
-                <w:szCs w:val="24"/>
-              </w:rPr>
-              <w:t>6 a 11 de la mañana</w:t>
-            </w:r>
-          </w:p>
-        </w:tc>
-        <w:tc>
-          <w:tcPr>
-            <w:tcW w:w="2588" w:type="dxa"/>
+            <w:tcW w:w="3219" w:type="dxa"/>
+          </w:tcPr>
+          <w:p>
+            <w:pPr>
+              <w:spacing w:after="0" w:line="240" w:lineRule="auto"/>
+              <w:jc w:val="both"/>
+              <w:rPr>
+                <w:rFonts w:ascii="Times New Roman" w:hAnsi="Times New Roman" w:cs="Times New Roman"/>
+                <w:sz w:val="24"/>
+                <w:szCs w:val="24"/>
+              </w:rPr>
+            </w:pPr>
+            <w:r>
+              <w:rPr>
+                <w:rFonts w:ascii="Times New Roman" w:hAnsi="Times New Roman" w:cs="Times New Roman"/>
+                <w:sz w:val="24"/>
+                <w:szCs w:val="24"/>
+              </w:rPr>
+              <w:t>Jueves: 6 a 11 de la mañana</w:t>
+            </w:r>
+          </w:p>
+        </w:tc>
+        <w:tc>
+          <w:tcPr>
+            <w:tcW w:w="2410" w:type="dxa"/>
+          </w:tcPr>
+          <w:p>
+            <w:pPr>
+              <w:spacing w:after="0" w:line="240" w:lineRule="auto"/>
+              <w:jc w:val="both"/>
+              <w:rPr>
+                <w:rFonts w:ascii="Times New Roman" w:hAnsi="Times New Roman" w:cs="Times New Roman"/>
+                <w:sz w:val="24"/>
+                <w:szCs w:val="24"/>
+              </w:rPr>
+            </w:pPr>
+          </w:p>
+        </w:tc>
+        <w:tc>
+          <w:tcPr>
+            <w:tcW w:w="2410" w:type="dxa"/>
           </w:tcPr>
           <w:p>
             <w:pPr>
@@ -2104,7 +2469,7 @@
         </w:trPr>
         <w:tc>
           <w:tcPr>
-            <w:tcW w:w="3003" w:type="dxa"/>
+            <w:tcW w:w="2784" w:type="dxa"/>
           </w:tcPr>
           <w:p>
             <w:r>
@@ -2114,7 +2479,7 @@
         </w:tc>
         <w:tc>
           <w:tcPr>
-            <w:tcW w:w="2170" w:type="dxa"/>
+            <w:tcW w:w="2168" w:type="dxa"/>
           </w:tcPr>
           <w:p>
             <w:r>
@@ -2124,7 +2489,7 @@
         </w:tc>
         <w:tc>
           <w:tcPr>
-            <w:tcW w:w="1941" w:type="dxa"/>
+            <w:tcW w:w="1709" w:type="dxa"/>
           </w:tcPr>
           <w:p>
             <w:pPr>
@@ -2150,31 +2515,47 @@
         </w:tc>
         <w:tc>
           <w:tcPr>
-            <w:tcW w:w="2588" w:type="dxa"/>
-          </w:tcPr>
-          <w:p>
-            <w:pPr>
-              <w:spacing w:after="0" w:line="240" w:lineRule="auto"/>
-              <w:jc w:val="both"/>
-              <w:rPr>
-                <w:rFonts w:ascii="Times New Roman" w:hAnsi="Times New Roman" w:cs="Times New Roman"/>
-                <w:sz w:val="24"/>
-                <w:szCs w:val="24"/>
-              </w:rPr>
-            </w:pPr>
-            <w:r>
-              <w:rPr>
-                <w:rFonts w:ascii="Times New Roman" w:hAnsi="Times New Roman" w:cs="Times New Roman"/>
-                <w:sz w:val="24"/>
-                <w:szCs w:val="24"/>
-              </w:rPr>
-              <w:t>6 a 11 de la mañana</w:t>
-            </w:r>
-          </w:p>
-        </w:tc>
-        <w:tc>
-          <w:tcPr>
-            <w:tcW w:w="2588" w:type="dxa"/>
+            <w:tcW w:w="3219" w:type="dxa"/>
+          </w:tcPr>
+          <w:p>
+            <w:pPr>
+              <w:spacing w:after="0" w:line="240" w:lineRule="auto"/>
+              <w:jc w:val="both"/>
+              <w:rPr>
+                <w:rFonts w:ascii="Times New Roman" w:hAnsi="Times New Roman" w:cs="Times New Roman"/>
+                <w:sz w:val="24"/>
+                <w:szCs w:val="24"/>
+              </w:rPr>
+            </w:pPr>
+            <w:r>
+              <w:rPr>
+                <w:rFonts w:ascii="Times New Roman" w:hAnsi="Times New Roman" w:cs="Times New Roman"/>
+                <w:sz w:val="24"/>
+                <w:szCs w:val="24"/>
+              </w:rPr>
+              <w:t>Jueves: 6 a 11 de la mañana</w:t>
+            </w:r>
+          </w:p>
+        </w:tc>
+        <w:tc>
+          <w:tcPr>
+            <w:tcW w:w="2410" w:type="dxa"/>
+          </w:tcPr>
+          <w:p>
+            <w:pPr>
+              <w:spacing w:after="0" w:line="240" w:lineRule="auto"/>
+              <w:jc w:val="both"/>
+              <w:rPr>
+                <w:rFonts w:ascii="Times New Roman" w:hAnsi="Times New Roman" w:cs="Times New Roman"/>
+                <w:sz w:val="24"/>
+                <w:szCs w:val="24"/>
+              </w:rPr>
+            </w:pPr>
+          </w:p>
+        </w:tc>
+        <w:tc>
+          <w:tcPr>
+            <w:tcW w:w="2410" w:type="dxa"/>
           </w:tcPr>
           <w:p>
             <w:pPr>
@@ -2195,7 +2576,7 @@
         </w:trPr>
         <w:tc>
           <w:tcPr>
-            <w:tcW w:w="3003" w:type="dxa"/>
+            <w:tcW w:w="2784" w:type="dxa"/>
           </w:tcPr>
           <w:p>
             <w:r>
@@ -2205,7 +2586,7 @@
         </w:tc>
         <w:tc>
           <w:tcPr>
-            <w:tcW w:w="2170" w:type="dxa"/>
+            <w:tcW w:w="2168" w:type="dxa"/>
           </w:tcPr>
           <w:p>
             <w:r>
@@ -2215,7 +2596,7 @@
         </w:tc>
         <w:tc>
           <w:tcPr>
-            <w:tcW w:w="1941" w:type="dxa"/>
+            <w:tcW w:w="1709" w:type="dxa"/>
           </w:tcPr>
           <w:p>
             <w:pPr>
@@ -2241,31 +2622,47 @@
         </w:tc>
         <w:tc>
           <w:tcPr>
-            <w:tcW w:w="2588" w:type="dxa"/>
-          </w:tcPr>
-          <w:p>
-            <w:pPr>
-              <w:spacing w:after="0" w:line="240" w:lineRule="auto"/>
-              <w:jc w:val="both"/>
-              <w:rPr>
-                <w:rFonts w:ascii="Times New Roman" w:hAnsi="Times New Roman" w:cs="Times New Roman"/>
-                <w:sz w:val="24"/>
-                <w:szCs w:val="24"/>
-              </w:rPr>
-            </w:pPr>
-            <w:r>
-              <w:rPr>
-                <w:rFonts w:ascii="Times New Roman" w:hAnsi="Times New Roman" w:cs="Times New Roman"/>
-                <w:sz w:val="24"/>
-                <w:szCs w:val="24"/>
-              </w:rPr>
-              <w:t>6 a 11 de la mañana</w:t>
-            </w:r>
-          </w:p>
-        </w:tc>
-        <w:tc>
-          <w:tcPr>
-            <w:tcW w:w="2588" w:type="dxa"/>
+            <w:tcW w:w="3219" w:type="dxa"/>
+          </w:tcPr>
+          <w:p>
+            <w:pPr>
+              <w:spacing w:after="0" w:line="240" w:lineRule="auto"/>
+              <w:jc w:val="both"/>
+              <w:rPr>
+                <w:rFonts w:ascii="Times New Roman" w:hAnsi="Times New Roman" w:cs="Times New Roman"/>
+                <w:sz w:val="24"/>
+                <w:szCs w:val="24"/>
+              </w:rPr>
+            </w:pPr>
+            <w:r>
+              <w:rPr>
+                <w:rFonts w:ascii="Times New Roman" w:hAnsi="Times New Roman" w:cs="Times New Roman"/>
+                <w:sz w:val="24"/>
+                <w:szCs w:val="24"/>
+              </w:rPr>
+              <w:t>Jueves: 6 a 11 de la mañana</w:t>
+            </w:r>
+          </w:p>
+        </w:tc>
+        <w:tc>
+          <w:tcPr>
+            <w:tcW w:w="2410" w:type="dxa"/>
+          </w:tcPr>
+          <w:p>
+            <w:pPr>
+              <w:spacing w:after="0" w:line="240" w:lineRule="auto"/>
+              <w:jc w:val="both"/>
+              <w:rPr>
+                <w:rFonts w:ascii="Times New Roman" w:hAnsi="Times New Roman" w:cs="Times New Roman"/>
+                <w:sz w:val="24"/>
+                <w:szCs w:val="24"/>
+              </w:rPr>
+            </w:pPr>
+          </w:p>
+        </w:tc>
+        <w:tc>
+          <w:tcPr>
+            <w:tcW w:w="2410" w:type="dxa"/>
           </w:tcPr>
           <w:p>
             <w:pPr>
@@ -2286,7 +2683,7 @@
         </w:trPr>
         <w:tc>
           <w:tcPr>
-            <w:tcW w:w="3003" w:type="dxa"/>
+            <w:tcW w:w="2784" w:type="dxa"/>
           </w:tcPr>
           <w:p>
             <w:r>
@@ -2296,7 +2693,7 @@
         </w:tc>
         <w:tc>
           <w:tcPr>
-            <w:tcW w:w="2170" w:type="dxa"/>
+            <w:tcW w:w="2168" w:type="dxa"/>
           </w:tcPr>
           <w:p>
             <w:r>
@@ -2306,7 +2703,7 @@
         </w:tc>
         <w:tc>
           <w:tcPr>
-            <w:tcW w:w="1941" w:type="dxa"/>
+            <w:tcW w:w="1709" w:type="dxa"/>
           </w:tcPr>
           <w:p>
             <w:pPr>
@@ -2332,31 +2729,47 @@
         </w:tc>
         <w:tc>
           <w:tcPr>
-            <w:tcW w:w="2588" w:type="dxa"/>
-          </w:tcPr>
-          <w:p>
-            <w:pPr>
-              <w:spacing w:after="0" w:line="240" w:lineRule="auto"/>
-              <w:jc w:val="both"/>
-              <w:rPr>
-                <w:rFonts w:ascii="Times New Roman" w:hAnsi="Times New Roman" w:cs="Times New Roman"/>
-                <w:sz w:val="24"/>
-                <w:szCs w:val="24"/>
-              </w:rPr>
-            </w:pPr>
-            <w:r>
-              <w:rPr>
-                <w:rFonts w:ascii="Times New Roman" w:hAnsi="Times New Roman" w:cs="Times New Roman"/>
-                <w:sz w:val="24"/>
-                <w:szCs w:val="24"/>
-              </w:rPr>
-              <w:t>6 a 11 de la mañana</w:t>
-            </w:r>
-          </w:p>
-        </w:tc>
-        <w:tc>
-          <w:tcPr>
-            <w:tcW w:w="2588" w:type="dxa"/>
+            <w:tcW w:w="3219" w:type="dxa"/>
+          </w:tcPr>
+          <w:p>
+            <w:pPr>
+              <w:spacing w:after="0" w:line="240" w:lineRule="auto"/>
+              <w:jc w:val="both"/>
+              <w:rPr>
+                <w:rFonts w:ascii="Times New Roman" w:hAnsi="Times New Roman" w:cs="Times New Roman"/>
+                <w:sz w:val="24"/>
+                <w:szCs w:val="24"/>
+              </w:rPr>
+            </w:pPr>
+            <w:r>
+              <w:rPr>
+                <w:rFonts w:ascii="Times New Roman" w:hAnsi="Times New Roman" w:cs="Times New Roman"/>
+                <w:sz w:val="24"/>
+                <w:szCs w:val="24"/>
+              </w:rPr>
+              <w:t>Jueves: 6 a 11 de la mañana</w:t>
+            </w:r>
+          </w:p>
+        </w:tc>
+        <w:tc>
+          <w:tcPr>
+            <w:tcW w:w="2410" w:type="dxa"/>
+          </w:tcPr>
+          <w:p>
+            <w:pPr>
+              <w:spacing w:after="0" w:line="240" w:lineRule="auto"/>
+              <w:jc w:val="both"/>
+              <w:rPr>
+                <w:rFonts w:ascii="Times New Roman" w:hAnsi="Times New Roman" w:cs="Times New Roman"/>
+                <w:sz w:val="24"/>
+                <w:szCs w:val="24"/>
+              </w:rPr>
+            </w:pPr>
+          </w:p>
+        </w:tc>
+        <w:tc>
+          <w:tcPr>
+            <w:tcW w:w="2410" w:type="dxa"/>
           </w:tcPr>
           <w:p>
             <w:pPr>
@@ -2377,7 +2790,7 @@
         </w:trPr>
         <w:tc>
           <w:tcPr>
-            <w:tcW w:w="3003" w:type="dxa"/>
+            <w:tcW w:w="2784" w:type="dxa"/>
           </w:tcPr>
           <w:p>
             <w:r>
@@ -2387,7 +2800,7 @@
         </w:tc>
         <w:tc>
           <w:tcPr>
-            <w:tcW w:w="2170" w:type="dxa"/>
+            <w:tcW w:w="2168" w:type="dxa"/>
           </w:tcPr>
           <w:p>
             <w:r>
@@ -2397,7 +2810,7 @@
         </w:tc>
         <w:tc>
           <w:tcPr>
-            <w:tcW w:w="1941" w:type="dxa"/>
+            <w:tcW w:w="1709" w:type="dxa"/>
           </w:tcPr>
           <w:p>
             <w:pPr>
@@ -2415,22 +2828,36 @@
         </w:tc>
         <w:tc>
           <w:tcPr>
-            <w:tcW w:w="2588" w:type="dxa"/>
-          </w:tcPr>
-          <w:p>
-            <w:r>
-              <w:rPr>
-                <w:rFonts w:ascii="Times New Roman" w:hAnsi="Times New Roman" w:cs="Times New Roman"/>
-                <w:sz w:val="24"/>
-                <w:szCs w:val="24"/>
-              </w:rPr>
-              <w:t>6 a 11 de la mañana</w:t>
-            </w:r>
-          </w:p>
-        </w:tc>
-        <w:tc>
-          <w:tcPr>
-            <w:tcW w:w="2588" w:type="dxa"/>
+            <w:tcW w:w="3219" w:type="dxa"/>
+          </w:tcPr>
+          <w:p>
+            <w:r>
+              <w:rPr>
+                <w:rFonts w:ascii="Times New Roman" w:hAnsi="Times New Roman" w:cs="Times New Roman"/>
+                <w:sz w:val="24"/>
+                <w:szCs w:val="24"/>
+              </w:rPr>
+              <w:t>Jueves: 6 a 11 de la mañana</w:t>
+            </w:r>
+          </w:p>
+        </w:tc>
+        <w:tc>
+          <w:tcPr>
+            <w:tcW w:w="2410" w:type="dxa"/>
+          </w:tcPr>
+          <w:p>
+            <w:pPr>
+              <w:rPr>
+                <w:rFonts w:ascii="Times New Roman" w:hAnsi="Times New Roman" w:cs="Times New Roman"/>
+                <w:sz w:val="24"/>
+                <w:szCs w:val="24"/>
+              </w:rPr>
+            </w:pPr>
+          </w:p>
+        </w:tc>
+        <w:tc>
+          <w:tcPr>
+            <w:tcW w:w="2410" w:type="dxa"/>
           </w:tcPr>
           <w:p>
             <w:pPr>
@@ -2449,7 +2876,7 @@
         </w:trPr>
         <w:tc>
           <w:tcPr>
-            <w:tcW w:w="3003" w:type="dxa"/>
+            <w:tcW w:w="2784" w:type="dxa"/>
           </w:tcPr>
           <w:p>
             <w:r>
@@ -2459,7 +2886,7 @@
         </w:tc>
         <w:tc>
           <w:tcPr>
-            <w:tcW w:w="2170" w:type="dxa"/>
+            <w:tcW w:w="2168" w:type="dxa"/>
           </w:tcPr>
           <w:p>
             <w:r>
@@ -2469,7 +2896,7 @@
         </w:tc>
         <w:tc>
           <w:tcPr>
-            <w:tcW w:w="1941" w:type="dxa"/>
+            <w:tcW w:w="1709" w:type="dxa"/>
           </w:tcPr>
           <w:p>
             <w:pPr>
@@ -2487,22 +2914,36 @@
         </w:tc>
         <w:tc>
           <w:tcPr>
-            <w:tcW w:w="2588" w:type="dxa"/>
-          </w:tcPr>
-          <w:p>
-            <w:r>
-              <w:rPr>
-                <w:rFonts w:ascii="Times New Roman" w:hAnsi="Times New Roman" w:cs="Times New Roman"/>
-                <w:sz w:val="24"/>
-                <w:szCs w:val="24"/>
-              </w:rPr>
-              <w:t>6 a 11 de la mañana</w:t>
-            </w:r>
-          </w:p>
-        </w:tc>
-        <w:tc>
-          <w:tcPr>
-            <w:tcW w:w="2588" w:type="dxa"/>
+            <w:tcW w:w="3219" w:type="dxa"/>
+          </w:tcPr>
+          <w:p>
+            <w:r>
+              <w:rPr>
+                <w:rFonts w:ascii="Times New Roman" w:hAnsi="Times New Roman" w:cs="Times New Roman"/>
+                <w:sz w:val="24"/>
+                <w:szCs w:val="24"/>
+              </w:rPr>
+              <w:t>Jueves: 6 a 11 de la mañana</w:t>
+            </w:r>
+          </w:p>
+        </w:tc>
+        <w:tc>
+          <w:tcPr>
+            <w:tcW w:w="2410" w:type="dxa"/>
+          </w:tcPr>
+          <w:p>
+            <w:pPr>
+              <w:rPr>
+                <w:rFonts w:ascii="Times New Roman" w:hAnsi="Times New Roman" w:cs="Times New Roman"/>
+                <w:sz w:val="24"/>
+                <w:szCs w:val="24"/>
+              </w:rPr>
+            </w:pPr>
+          </w:p>
+        </w:tc>
+        <w:tc>
+          <w:tcPr>
+            <w:tcW w:w="2410" w:type="dxa"/>
           </w:tcPr>
           <w:p>
             <w:pPr>
@@ -2541,19 +2982,21 @@
         <w:jc w:val="both"/>
         <w:rPr>
           <w:rFonts w:ascii="Times New Roman" w:hAnsi="Times New Roman"/>
+          <w:b/>
+          <w:bCs/>
           <w:iCs/>
           <w:sz w:val="24"/>
           <w:szCs w:val="24"/>
-          <w:highlight w:val="yellow"/>
-          <w:lang w:val="es-MX"/>
-        </w:rPr>
-      </w:pPr>
-      <w:r>
-        <w:rPr>
-          <w:rFonts w:ascii="Times New Roman" w:hAnsi="Times New Roman"/>
-          <w:sz w:val="24"/>
-          <w:szCs w:val="24"/>
-          <w:highlight w:val="yellow"/>
+          <w:lang w:val="es-MX"/>
+        </w:rPr>
+      </w:pPr>
+      <w:r>
+        <w:rPr>
+          <w:rFonts w:ascii="Times New Roman" w:hAnsi="Times New Roman"/>
+          <w:b/>
+          <w:bCs/>
+          <w:sz w:val="24"/>
+          <w:szCs w:val="24"/>
           <w:lang w:val="es-MX"/>
         </w:rPr>
         <w:t>Datos del Docente de la Universidad Asesor de Práctica</w:t>
@@ -2935,20 +3378,22 @@
         <w:jc w:val="both"/>
         <w:rPr>
           <w:rFonts w:ascii="Times New Roman" w:hAnsi="Times New Roman"/>
+          <w:b/>
+          <w:bCs/>
           <w:iCs/>
           <w:sz w:val="24"/>
           <w:szCs w:val="24"/>
-          <w:highlight w:val="yellow"/>
-          <w:lang w:val="es-MX"/>
-        </w:rPr>
-      </w:pPr>
-      <w:r>
-        <w:rPr>
-          <w:rFonts w:ascii="Times New Roman" w:hAnsi="Times New Roman"/>
+          <w:lang w:val="es-MX"/>
+        </w:rPr>
+      </w:pPr>
+      <w:r>
+        <w:rPr>
+          <w:rFonts w:ascii="Times New Roman" w:hAnsi="Times New Roman"/>
+          <w:b/>
+          <w:bCs/>
           <w:iCs/>
           <w:sz w:val="24"/>
           <w:szCs w:val="24"/>
-          <w:highlight w:val="yellow"/>
           <w:lang w:val="es-MX"/>
         </w:rPr>
         <w:t>Datos del Centro de Práctica</w:t>
@@ -2972,7 +3417,7 @@
     </w:p>
     <w:tbl>
       <w:tblPr>
-        <w:tblW w:w="9076" w:type="dxa"/>
+        <w:tblW w:w="17146" w:type="dxa"/>
         <w:jc w:val="center"/>
         <w:tblBorders>
           <w:top w:val="single" w:sz="4" w:space="0" w:color="auto"/>
@@ -2985,11 +3430,11 @@
         <w:tblLook w:val="04A0" w:firstRow="1" w:lastRow="0" w:firstColumn="1" w:lastColumn="0" w:noHBand="0" w:noVBand="1"/>
       </w:tblPr>
       <w:tblGrid>
-        <w:gridCol w:w="2710"/>
-        <w:gridCol w:w="1416"/>
-        <w:gridCol w:w="1203"/>
-        <w:gridCol w:w="2371"/>
-        <w:gridCol w:w="1376"/>
+        <w:gridCol w:w="4470"/>
+        <w:gridCol w:w="2216"/>
+        <w:gridCol w:w="1923"/>
+        <w:gridCol w:w="6144"/>
+        <w:gridCol w:w="2393"/>
       </w:tblGrid>
       <w:tr>
         <w:trPr>
@@ -2997,7 +3442,7 @@
         </w:trPr>
         <w:tc>
           <w:tcPr>
-            <w:tcW w:w="2350" w:type="dxa"/>
+            <w:tcW w:w="4470" w:type="dxa"/>
             <w:shd w:val="clear" w:color="auto" w:fill="EAF1DD"/>
           </w:tcPr>
           <w:p>
@@ -3028,7 +3473,7 @@
         </w:tc>
         <w:tc>
           <w:tcPr>
-            <w:tcW w:w="1037" w:type="dxa"/>
+            <w:tcW w:w="2216" w:type="dxa"/>
             <w:shd w:val="clear" w:color="auto" w:fill="EAF1DD"/>
           </w:tcPr>
           <w:p>
@@ -3059,7 +3504,7 @@
         </w:tc>
         <w:tc>
           <w:tcPr>
-            <w:tcW w:w="1113" w:type="dxa"/>
+            <w:tcW w:w="1923" w:type="dxa"/>
             <w:shd w:val="clear" w:color="auto" w:fill="EAF1DD"/>
           </w:tcPr>
           <w:p>
@@ -3090,7 +3535,7 @@
         </w:tc>
         <w:tc>
           <w:tcPr>
-            <w:tcW w:w="3600" w:type="dxa"/>
+            <w:tcW w:w="6144" w:type="dxa"/>
             <w:shd w:val="clear" w:color="auto" w:fill="EAF1DD"/>
           </w:tcPr>
           <w:p>
@@ -3121,7 +3566,7 @@
         </w:tc>
         <w:tc>
           <w:tcPr>
-            <w:tcW w:w="976" w:type="dxa"/>
+            <w:tcW w:w="2393" w:type="dxa"/>
             <w:shd w:val="clear" w:color="auto" w:fill="EAF1DD"/>
           </w:tcPr>
           <w:p>
@@ -3157,7 +3602,7 @@
         </w:trPr>
         <w:tc>
           <w:tcPr>
-            <w:tcW w:w="2350" w:type="dxa"/>
+            <w:tcW w:w="4470" w:type="dxa"/>
           </w:tcPr>
           <w:p>
             <w:pPr>
@@ -3185,7 +3630,7 @@
         </w:tc>
         <w:tc>
           <w:tcPr>
-            <w:tcW w:w="1037" w:type="dxa"/>
+            <w:tcW w:w="2216" w:type="dxa"/>
           </w:tcPr>
           <w:p>
             <w:pPr>
@@ -3211,7 +3656,7 @@
         </w:tc>
         <w:tc>
           <w:tcPr>
-            <w:tcW w:w="1113" w:type="dxa"/>
+            <w:tcW w:w="1923" w:type="dxa"/>
           </w:tcPr>
           <w:p>
             <w:pPr>
@@ -3237,7 +3682,7 @@
         </w:tc>
         <w:tc>
           <w:tcPr>
-            <w:tcW w:w="3600" w:type="dxa"/>
+            <w:tcW w:w="6144" w:type="dxa"/>
           </w:tcPr>
           <w:p>
             <w:pPr>
@@ -3249,7 +3694,6 @@
                 <w:lang w:val="es-MX"/>
               </w:rPr>
             </w:pPr>
-            <w:proofErr w:type="spellStart"/>
             <w:r>
               <w:rPr>
                 <w:rFonts w:ascii="Times New Roman" w:hAnsi="Times New Roman" w:cs="Times New Roman"/>
@@ -3257,14 +3701,52 @@
                 <w:szCs w:val="24"/>
                 <w:lang w:val="es-MX"/>
               </w:rPr>
-              <w:t>rectoria@ie</w:t>
-            </w:r>
-            <w:proofErr w:type="spellEnd"/>
-          </w:p>
-        </w:tc>
-        <w:tc>
-          <w:tcPr>
-            <w:tcW w:w="976" w:type="dxa"/>
+              <w:t>rectoria@i</w:t>
+            </w:r>
+            <w:r>
+              <w:rPr>
+                <w:rFonts w:ascii="Times New Roman" w:hAnsi="Times New Roman" w:cs="Times New Roman"/>
+                <w:sz w:val="24"/>
+                <w:szCs w:val="24"/>
+                <w:lang w:val="es-MX"/>
+              </w:rPr>
+              <w:t>eliceocaucasia.edu.co</w:t>
+            </w:r>
+          </w:p>
+          <w:p>
+            <w:pPr>
+              <w:jc w:val="both"/>
+              <w:rPr>
+                <w:rFonts w:ascii="Times New Roman" w:hAnsi="Times New Roman" w:cs="Times New Roman"/>
+                <w:sz w:val="24"/>
+                <w:szCs w:val="24"/>
+                <w:lang w:val="es-MX"/>
+              </w:rPr>
+            </w:pPr>
+          </w:p>
+          <w:p>
+            <w:pPr>
+              <w:jc w:val="both"/>
+              <w:rPr>
+                <w:rFonts w:ascii="Times New Roman" w:hAnsi="Times New Roman" w:cs="Times New Roman"/>
+                <w:sz w:val="24"/>
+                <w:szCs w:val="24"/>
+                <w:lang w:val="es-MX"/>
+              </w:rPr>
+            </w:pPr>
+            <w:r>
+              <w:rPr>
+                <w:rFonts w:ascii="Times New Roman" w:hAnsi="Times New Roman" w:cs="Times New Roman"/>
+                <w:sz w:val="24"/>
+                <w:szCs w:val="24"/>
+              </w:rPr>
+              <w:t>secretaria@ieliceocaucasia.edu.co</w:t>
+            </w:r>
+          </w:p>
+        </w:tc>
+        <w:tc>
+          <w:tcPr>
+            <w:tcW w:w="2393" w:type="dxa"/>
           </w:tcPr>
           <w:p>
             <w:pPr>
@@ -3299,6 +3781,8 @@
         <w:jc w:val="both"/>
         <w:rPr>
           <w:rFonts w:ascii="Times New Roman" w:hAnsi="Times New Roman"/>
+          <w:b/>
+          <w:bCs/>
           <w:iCs/>
           <w:sz w:val="24"/>
           <w:szCs w:val="24"/>
@@ -3318,20 +3802,22 @@
         <w:jc w:val="both"/>
         <w:rPr>
           <w:rFonts w:ascii="Times New Roman" w:hAnsi="Times New Roman"/>
+          <w:b/>
+          <w:bCs/>
           <w:iCs/>
           <w:sz w:val="24"/>
           <w:szCs w:val="24"/>
-          <w:highlight w:val="yellow"/>
-          <w:lang w:val="es-MX"/>
-        </w:rPr>
-      </w:pPr>
-      <w:r>
-        <w:rPr>
-          <w:rFonts w:ascii="Times New Roman" w:hAnsi="Times New Roman"/>
+          <w:lang w:val="es-MX"/>
+        </w:rPr>
+      </w:pPr>
+      <w:r>
+        <w:rPr>
+          <w:rFonts w:ascii="Times New Roman" w:hAnsi="Times New Roman"/>
+          <w:b/>
+          <w:bCs/>
           <w:iCs/>
           <w:sz w:val="24"/>
           <w:szCs w:val="24"/>
-          <w:highlight w:val="yellow"/>
           <w:lang w:val="es-MX"/>
         </w:rPr>
         <w:t xml:space="preserve">Datos del Cooperador Institucional </w:t>
@@ -3692,99 +4178,86 @@
         <w:jc w:val="both"/>
         <w:rPr>
           <w:rFonts w:ascii="Times New Roman" w:hAnsi="Times New Roman" w:cs="Times New Roman"/>
-          <w:b/>
-          <w:sz w:val="24"/>
-          <w:szCs w:val="24"/>
-          <w:lang w:val="es-MX"/>
-        </w:rPr>
-      </w:pPr>
+          <w:bCs/>
+          <w:sz w:val="24"/>
+          <w:szCs w:val="24"/>
+          <w:lang w:val="es-MX"/>
+        </w:rPr>
+      </w:pPr>
+      <w:r>
+        <w:rPr>
+          <w:rFonts w:ascii="Times New Roman" w:hAnsi="Times New Roman" w:cs="Times New Roman"/>
+          <w:b/>
+          <w:sz w:val="24"/>
+          <w:szCs w:val="24"/>
+          <w:lang w:val="es-MX"/>
+        </w:rPr>
+        <w:t xml:space="preserve">3.1 Modalidad de práctica: </w:t>
+      </w:r>
+      <w:r>
+        <w:rPr>
+          <w:rFonts w:ascii="Times New Roman" w:hAnsi="Times New Roman" w:cs="Times New Roman"/>
+          <w:bCs/>
+          <w:sz w:val="24"/>
+          <w:szCs w:val="24"/>
+          <w:lang w:val="es-MX"/>
+        </w:rPr>
+        <w:t xml:space="preserve">presencial </w:t>
+      </w:r>
     </w:p>
     <w:p>
       <w:pPr>
         <w:spacing w:after="0" w:line="240" w:lineRule="auto"/>
         <w:contextualSpacing/>
-        <w:jc w:val="both"/>
-        <w:rPr>
-          <w:rFonts w:ascii="Times New Roman" w:hAnsi="Times New Roman" w:cs="Times New Roman"/>
-          <w:bCs/>
-          <w:sz w:val="24"/>
-          <w:szCs w:val="24"/>
-          <w:lang w:val="es-MX"/>
-        </w:rPr>
-      </w:pPr>
-      <w:r>
-        <w:rPr>
-          <w:rFonts w:ascii="Times New Roman" w:hAnsi="Times New Roman" w:cs="Times New Roman"/>
-          <w:b/>
-          <w:sz w:val="24"/>
-          <w:szCs w:val="24"/>
-          <w:lang w:val="es-MX"/>
-        </w:rPr>
-        <w:t xml:space="preserve">3.1 Modalidad de práctica: </w:t>
-      </w:r>
-      <w:r>
-        <w:rPr>
-          <w:rFonts w:ascii="Times New Roman" w:hAnsi="Times New Roman" w:cs="Times New Roman"/>
-          <w:bCs/>
-          <w:sz w:val="24"/>
-          <w:szCs w:val="24"/>
-          <w:lang w:val="es-MX"/>
-        </w:rPr>
-        <w:t xml:space="preserve">presencial </w:t>
+        <w:rPr>
+          <w:rFonts w:ascii="Arial" w:hAnsi="Arial" w:cs="Arial"/>
+          <w:b/>
+          <w:sz w:val="24"/>
+          <w:szCs w:val="24"/>
+          <w:lang w:val="es-MX"/>
+        </w:rPr>
+      </w:pPr>
+      <w:r>
+        <w:rPr>
+          <w:rFonts w:ascii="Arial" w:hAnsi="Arial" w:cs="Arial"/>
+          <w:b/>
+          <w:sz w:val="24"/>
+          <w:szCs w:val="24"/>
+          <w:lang w:val="es-MX"/>
+        </w:rPr>
+        <w:t>3.2 Objetivos del curso en el Centro de práctica</w:t>
       </w:r>
     </w:p>
     <w:p>
       <w:pPr>
         <w:spacing w:after="0" w:line="240" w:lineRule="auto"/>
         <w:contextualSpacing/>
-        <w:jc w:val="both"/>
-        <w:rPr>
-          <w:rFonts w:ascii="Times New Roman" w:hAnsi="Times New Roman" w:cs="Times New Roman"/>
-          <w:bCs/>
-          <w:sz w:val="24"/>
-          <w:szCs w:val="24"/>
-          <w:lang w:val="es-MX"/>
-        </w:rPr>
-      </w:pPr>
+        <w:rPr>
+          <w:rFonts w:ascii="Arial" w:hAnsi="Arial" w:cs="Arial"/>
+          <w:bCs/>
+          <w:sz w:val="24"/>
+          <w:szCs w:val="24"/>
+        </w:rPr>
+      </w:pPr>
+      <w:r>
+        <w:rPr>
+          <w:rFonts w:ascii="Arial" w:hAnsi="Arial" w:cs="Arial"/>
+          <w:bCs/>
+          <w:sz w:val="24"/>
+          <w:szCs w:val="24"/>
+        </w:rPr>
+        <w:t>Los objetivos específicos relacionados con el desarrollo del pensamiento matemático en el Centro de Práctica son:</w:t>
+      </w:r>
     </w:p>
     <w:p>
       <w:pPr>
         <w:spacing w:after="0" w:line="240" w:lineRule="auto"/>
         <w:contextualSpacing/>
-        <w:jc w:val="both"/>
-        <w:rPr>
-          <w:rFonts w:ascii="Times New Roman" w:hAnsi="Times New Roman" w:cs="Times New Roman"/>
-          <w:bCs/>
-          <w:sz w:val="24"/>
-          <w:szCs w:val="24"/>
-          <w:lang w:val="es-MX"/>
-        </w:rPr>
-      </w:pPr>
-    </w:p>
-    <w:p>
-      <w:pPr>
-        <w:spacing w:after="0" w:line="240" w:lineRule="auto"/>
-        <w:contextualSpacing/>
-        <w:jc w:val="both"/>
-        <w:rPr>
-          <w:rFonts w:ascii="Times New Roman" w:hAnsi="Times New Roman" w:cs="Times New Roman"/>
-          <w:b/>
-          <w:sz w:val="24"/>
-          <w:szCs w:val="24"/>
-          <w:lang w:val="es-MX"/>
-        </w:rPr>
-      </w:pPr>
-    </w:p>
-    <w:p>
-      <w:pPr>
-        <w:spacing w:after="0" w:line="240" w:lineRule="auto"/>
-        <w:contextualSpacing/>
         <w:rPr>
           <w:rFonts w:ascii="Arial" w:hAnsi="Arial" w:cs="Arial"/>
           <w:b/>
           <w:sz w:val="24"/>
           <w:szCs w:val="24"/>
-          <w:lang w:val="es-MX"/>
         </w:rPr>
       </w:pPr>
       <w:r>
@@ -3793,43 +4266,9 @@
           <w:b/>
           <w:sz w:val="24"/>
           <w:szCs w:val="24"/>
-          <w:lang w:val="es-MX"/>
-        </w:rPr>
-        <w:t>3.2 Objetivos del curso en el Centro de práctica</w:t>
-      </w:r>
-    </w:p>
-    <w:p>
-      <w:pPr>
-        <w:spacing w:after="0" w:line="240" w:lineRule="auto"/>
-        <w:contextualSpacing/>
-        <w:rPr>
-          <w:rFonts w:ascii="Arial" w:hAnsi="Arial" w:cs="Arial"/>
-          <w:b/>
-          <w:sz w:val="24"/>
-          <w:szCs w:val="24"/>
-        </w:rPr>
-      </w:pPr>
-      <w:r>
-        <w:rPr>
-          <w:rFonts w:ascii="Arial" w:hAnsi="Arial" w:cs="Arial"/>
-          <w:b/>
-          <w:sz w:val="24"/>
-          <w:szCs w:val="24"/>
-        </w:rPr>
-        <w:t>Los objetivos específicos relacionados con el desarrollo del pensamiento matemático en el Centro de Práctica son:</w:t>
-      </w:r>
-    </w:p>
-    <w:p>
-      <w:pPr>
-        <w:spacing w:after="0" w:line="240" w:lineRule="auto"/>
-        <w:contextualSpacing/>
-        <w:rPr>
-          <w:rFonts w:ascii="Arial" w:hAnsi="Arial" w:cs="Arial"/>
-          <w:b/>
-          <w:sz w:val="24"/>
-          <w:szCs w:val="24"/>
-        </w:rPr>
-      </w:pPr>
+        </w:rPr>
+        <w:t xml:space="preserve">  </w:t>
+      </w:r>
       <w:r>
         <w:rPr>
           <w:rFonts w:ascii="Arial" w:hAnsi="Arial" w:cs="Arial"/>
@@ -5357,36 +5796,6 @@
         <w:jc w:val="both"/>
         <w:rPr>
           <w:rFonts w:ascii="Times New Roman" w:hAnsi="Times New Roman" w:cs="Times New Roman"/>
-        </w:rPr>
-      </w:pPr>
-    </w:p>
-    <w:p>
-      <w:pPr>
-        <w:spacing w:after="0" w:line="240" w:lineRule="auto"/>
-        <w:jc w:val="both"/>
-        <w:rPr>
-          <w:rFonts w:ascii="Times New Roman" w:hAnsi="Times New Roman" w:cs="Times New Roman"/>
-        </w:rPr>
-      </w:pPr>
-    </w:p>
-    <w:p>
-      <w:pPr>
-        <w:spacing w:after="0" w:line="240" w:lineRule="auto"/>
-        <w:ind w:firstLineChars="2500" w:firstLine="5500"/>
-        <w:jc w:val="both"/>
-        <w:rPr>
-          <w:rFonts w:ascii="Times New Roman" w:hAnsi="Times New Roman" w:cs="Times New Roman"/>
-          <w:lang w:val="es-ES"/>
-        </w:rPr>
-      </w:pPr>
-    </w:p>
-    <w:p>
-      <w:pPr>
-        <w:spacing w:after="0" w:line="240" w:lineRule="auto"/>
-        <w:ind w:firstLineChars="2500" w:firstLine="5500"/>
-        <w:jc w:val="both"/>
-        <w:rPr>
-          <w:rFonts w:ascii="Times New Roman" w:hAnsi="Times New Roman" w:cs="Times New Roman"/>
           <w:lang w:val="es-ES"/>
         </w:rPr>
       </w:pPr>
@@ -5548,7 +5957,6 @@
     <w:p>
       <w:pPr>
         <w:spacing w:after="0" w:line="240" w:lineRule="auto"/>
-        <w:jc w:val="center"/>
         <w:rPr>
           <w:rFonts w:ascii="Times New Roman" w:hAnsi="Times New Roman" w:cs="Times New Roman"/>
           <w:b/>
@@ -5563,33 +5971,48 @@
         </w:rPr>
         <w:t>Por el Centro de práctica</w:t>
       </w:r>
-    </w:p>
-    <w:p>
-      <w:pPr>
-        <w:spacing w:after="0" w:line="240" w:lineRule="auto"/>
-        <w:jc w:val="center"/>
-        <w:rPr>
-          <w:rFonts w:ascii="Times New Roman" w:hAnsi="Times New Roman" w:cs="Times New Roman"/>
-          <w:b/>
-          <w:bCs/>
-        </w:rPr>
-      </w:pPr>
-    </w:p>
-    <w:p>
-      <w:pPr>
-        <w:spacing w:after="0" w:line="240" w:lineRule="auto"/>
-        <w:jc w:val="center"/>
-        <w:rPr>
-          <w:rFonts w:ascii="Times New Roman" w:hAnsi="Times New Roman" w:cs="Times New Roman"/>
-          <w:b/>
-          <w:bCs/>
-        </w:rPr>
-      </w:pPr>
-    </w:p>
-    <w:p>
-      <w:pPr>
-        <w:spacing w:after="0" w:line="240" w:lineRule="auto"/>
-        <w:jc w:val="center"/>
+      <w:r>
+        <w:rPr>
+          <w:rFonts w:ascii="Times New Roman" w:hAnsi="Times New Roman" w:cs="Times New Roman"/>
+          <w:b/>
+          <w:bCs/>
+        </w:rPr>
+        <w:t xml:space="preserve">  </w:t>
+      </w:r>
+    </w:p>
+    <w:p>
+      <w:pPr>
+        <w:spacing w:after="0" w:line="240" w:lineRule="auto"/>
+        <w:rPr>
+          <w:rFonts w:ascii="Times New Roman" w:hAnsi="Times New Roman" w:cs="Times New Roman"/>
+          <w:b/>
+          <w:bCs/>
+        </w:rPr>
+      </w:pPr>
+    </w:p>
+    <w:p>
+      <w:pPr>
+        <w:spacing w:after="0" w:line="240" w:lineRule="auto"/>
+        <w:rPr>
+          <w:rFonts w:ascii="Times New Roman" w:hAnsi="Times New Roman" w:cs="Times New Roman"/>
+          <w:b/>
+          <w:bCs/>
+        </w:rPr>
+      </w:pPr>
+      <w:r>
+        <w:rPr>
+          <w:rFonts w:ascii="Times New Roman" w:hAnsi="Times New Roman" w:cs="Times New Roman"/>
+          <w:color w:val="FF0000"/>
+          <w:sz w:val="24"/>
+          <w:szCs w:val="24"/>
+          <w:lang w:val="es-MX"/>
+        </w:rPr>
+        <w:t>José Pío Viloria Luna</w:t>
+      </w:r>
+    </w:p>
+    <w:p>
+      <w:pPr>
+        <w:spacing w:after="0" w:line="240" w:lineRule="auto"/>
         <w:rPr>
           <w:rFonts w:ascii="Times New Roman" w:hAnsi="Times New Roman" w:cs="Times New Roman"/>
         </w:rPr>
@@ -5606,53 +6029,67 @@
     <w:p>
       <w:pPr>
         <w:spacing w:after="0" w:line="240" w:lineRule="auto"/>
-        <w:jc w:val="center"/>
-        <w:rPr>
-          <w:rFonts w:ascii="Times New Roman" w:hAnsi="Times New Roman" w:cs="Times New Roman"/>
-          <w:bCs/>
-        </w:rPr>
-      </w:pPr>
-      <w:r>
-        <w:rPr>
-          <w:rFonts w:ascii="Times New Roman" w:hAnsi="Times New Roman" w:cs="Times New Roman"/>
-          <w:bCs/>
-          <w:highlight w:val="yellow"/>
-        </w:rPr>
-        <w:t>Carg</w:t>
-      </w:r>
-      <w:r>
-        <w:rPr>
-          <w:rFonts w:ascii="Times New Roman" w:hAnsi="Times New Roman" w:cs="Times New Roman"/>
-          <w:bCs/>
-        </w:rPr>
-        <w:t>o</w:t>
-      </w:r>
-    </w:p>
-    <w:p>
-      <w:pPr>
-        <w:spacing w:after="0" w:line="240" w:lineRule="auto"/>
-        <w:jc w:val="center"/>
-        <w:rPr>
-          <w:rFonts w:ascii="Times New Roman" w:hAnsi="Times New Roman" w:cs="Times New Roman"/>
-        </w:rPr>
-      </w:pPr>
-      <w:r>
-        <w:rPr>
-          <w:rFonts w:ascii="Times New Roman" w:hAnsi="Times New Roman" w:cs="Times New Roman"/>
-          <w:highlight w:val="yellow"/>
-        </w:rPr>
-        <w:t>Nombre del Centro de práctica</w:t>
-      </w:r>
-    </w:p>
-    <w:p>
-      <w:pPr>
-        <w:jc w:val="center"/>
-      </w:pPr>
-      <w:r>
-        <w:rPr>
-          <w:highlight w:val="yellow"/>
-        </w:rPr>
-        <w:t>Correo electrónico</w:t>
+        <w:rPr>
+          <w:rFonts w:ascii="Times New Roman" w:hAnsi="Times New Roman" w:cs="Times New Roman"/>
+          <w:bCs/>
+        </w:rPr>
+      </w:pPr>
+      <w:r>
+        <w:rPr>
+          <w:rFonts w:ascii="Times New Roman" w:hAnsi="Times New Roman" w:cs="Times New Roman"/>
+          <w:bCs/>
+        </w:rPr>
+        <w:t>Coordinador Académico</w:t>
+      </w:r>
+    </w:p>
+    <w:p>
+      <w:pPr>
+        <w:spacing w:after="0" w:line="240" w:lineRule="auto"/>
+        <w:rPr>
+          <w:rFonts w:ascii="Times New Roman" w:hAnsi="Times New Roman" w:cs="Times New Roman"/>
+        </w:rPr>
+      </w:pPr>
+      <w:proofErr w:type="spellStart"/>
+      <w:r>
+        <w:rPr>
+          <w:rFonts w:ascii="Times New Roman" w:hAnsi="Times New Roman" w:cs="Times New Roman"/>
+        </w:rPr>
+        <w:t>I.</w:t>
+      </w:r>
+      <w:proofErr w:type="gramStart"/>
+      <w:r>
+        <w:rPr>
+          <w:rFonts w:ascii="Times New Roman" w:hAnsi="Times New Roman" w:cs="Times New Roman"/>
+        </w:rPr>
+        <w:t>E.Liceo</w:t>
+      </w:r>
+      <w:proofErr w:type="spellEnd"/>
+      <w:proofErr w:type="gramEnd"/>
+      <w:r>
+        <w:rPr>
+          <w:rFonts w:ascii="Times New Roman" w:hAnsi="Times New Roman" w:cs="Times New Roman"/>
+        </w:rPr>
+        <w:t xml:space="preserve"> Caucasia</w:t>
+      </w:r>
+    </w:p>
+    <w:p>
+      <w:pPr>
+        <w:spacing w:after="0" w:line="240" w:lineRule="auto"/>
+        <w:rPr>
+          <w:rFonts w:ascii="Times New Roman" w:hAnsi="Times New Roman" w:cs="Times New Roman"/>
+          <w:sz w:val="24"/>
+          <w:szCs w:val="24"/>
+          <w:lang w:val="es-MX"/>
+        </w:rPr>
+      </w:pPr>
+      <w:r>
+        <w:rPr>
+          <w:rFonts w:ascii="Times New Roman" w:hAnsi="Times New Roman" w:cs="Times New Roman"/>
+          <w:sz w:val="24"/>
+          <w:szCs w:val="24"/>
+          <w:lang w:val="es-MX"/>
+        </w:rPr>
+        <w:t>Vilorialuna16@gmail.com</w:t>
       </w:r>
     </w:p>
     <w:p>
@@ -6609,7 +7046,6 @@
   <w:style w:type="character" w:default="1" w:styleId="Fuentedeprrafopredeter">
     <w:name w:val="Default Paragraph Font"/>
     <w:uiPriority w:val="1"/>
-    <w:semiHidden/>
     <w:unhideWhenUsed/>
   </w:style>
   <w:style w:type="table" w:default="1" w:styleId="Tablanormal">
@@ -7213,10 +7649,6 @@
 </file>
 
 <file path=customXml/item1.xml><?xml version="1.0" encoding="utf-8"?>
-<b:Sources xmlns:b="http://schemas.openxmlformats.org/officeDocument/2006/bibliography" xmlns="http://schemas.openxmlformats.org/officeDocument/2006/bibliography" SelectedStyle="/APA.XSL" StyleName="APA"/>
-</file>
-
-<file path=customXml/item2.xml><?xml version="1.0" encoding="utf-8"?>
 <s:customData xmlns="http://www.wps.cn/officeDocument/2013/wpsCustomData" xmlns:s="http://www.wps.cn/officeDocument/2013/wpsCustomData">
   <customSectProps/>
   <customShpExts>
@@ -7226,18 +7658,22 @@
 </s:customData>
 </file>
 
+<file path=customXml/item2.xml><?xml version="1.0" encoding="utf-8"?>
+<b:Sources xmlns:b="http://schemas.openxmlformats.org/officeDocument/2006/bibliography" xmlns="http://schemas.openxmlformats.org/officeDocument/2006/bibliography" SelectedStyle="/APA.XSL" StyleName="APA"/>
+</file>
+
 <file path=customXml/itemProps1.xml><?xml version="1.0" encoding="utf-8"?>
+<ds:datastoreItem xmlns:ds="http://schemas.openxmlformats.org/officeDocument/2006/customXml" ds:itemID="{B1977F7D-205B-4081-913C-38D41E755F92}">
+  <ds:schemaRefs>
+    <ds:schemaRef ds:uri="http://www.wps.cn/officeDocument/2013/wpsCustomData"/>
+  </ds:schemaRefs>
+</ds:datastoreItem>
+</file>
+
+<file path=customXml/itemProps2.xml><?xml version="1.0" encoding="utf-8"?>
 <ds:datastoreItem xmlns:ds="http://schemas.openxmlformats.org/officeDocument/2006/customXml" ds:itemID="{2D82C844-1AE0-44AC-90E9-92968CB8230D}">
   <ds:schemaRefs>
     <ds:schemaRef ds:uri="http://schemas.openxmlformats.org/officeDocument/2006/bibliography"/>
   </ds:schemaRefs>
 </ds:datastoreItem>
-</file>
-
-<file path=customXml/itemProps2.xml><?xml version="1.0" encoding="utf-8"?>
-<ds:datastoreItem xmlns:ds="http://schemas.openxmlformats.org/officeDocument/2006/customXml" ds:itemID="{B1977F7D-205B-4081-913C-38D41E755F92}">
-  <ds:schemaRefs>
-    <ds:schemaRef ds:uri="http://www.wps.cn/officeDocument/2013/wpsCustomData"/>
-  </ds:schemaRefs>
-</ds:datastoreItem>
 </file>
</xml_diff>